<commit_message>
docs(submission): fill in team name and add evaluation-criteria map to Project Description
</commit_message>
<xml_diff>
--- a/submission/AegisAgent_Project_Description.docx
+++ b/submission/AegisAgent_Project_Description.docx
@@ -3,16 +3,22 @@
 <w:document xmlns:wpc="http://schemas.microsoft.com/office/word/2010/wordprocessingCanvas" xmlns:mo="http://schemas.microsoft.com/office/mac/office/2008/main" xmlns:mc="http://schemas.openxmlformats.org/markup-compatibility/2006" xmlns:mv="urn:schemas-microsoft-com:mac:vml" xmlns:o="urn:schemas-microsoft-com:office:office" xmlns:r="http://schemas.openxmlformats.org/officeDocument/2006/relationships" xmlns:m="http://schemas.openxmlformats.org/officeDocument/2006/math" xmlns:v="urn:schemas-microsoft-com:vml" xmlns:wp14="http://schemas.microsoft.com/office/word/2010/wordprocessingDrawing" xmlns:wp="http://schemas.openxmlformats.org/drawingml/2006/wordprocessingDrawing" xmlns:w10="urn:schemas-microsoft-com:office:word" xmlns:w="http://schemas.openxmlformats.org/wordprocessingml/2006/main" xmlns:w14="http://schemas.microsoft.com/office/word/2010/wordml" xmlns:wpg="http://schemas.microsoft.com/office/word/2010/wordprocessingGroup" xmlns:wpi="http://schemas.microsoft.com/office/word/2010/wordprocessingInk" xmlns:wne="http://schemas.microsoft.com/office/word/2006/wordml" xmlns:wps="http://schemas.microsoft.com/office/word/2010/wordprocessingShape" mc:Ignorable="w14 wp14">
   <w:body>
     <w:p>
+      <w:pPr>
+        <w:jc w:val="center"/>
+      </w:pPr>
       <w:r>
         <w:rPr>
           <w:b/>
-          <w:color w:val="0F7666"/>
+          <w:color w:val="555555"/>
           <w:sz w:val="20"/>
         </w:rPr>
         <w:t>PROJECT DESCRIPTION</w:t>
       </w:r>
     </w:p>
     <w:p>
+      <w:pPr>
+        <w:jc w:val="center"/>
+      </w:pPr>
       <w:r>
         <w:rPr>
           <w:b/>
@@ -23,148 +29,431 @@
       </w:r>
     </w:p>
     <w:p>
+      <w:pPr>
+        <w:spacing w:after="280"/>
+        <w:jc w:val="center"/>
+      </w:pPr>
       <w:r>
         <w:rPr>
           <w:i/>
-          <w:color w:val="555555"/>
-          <w:sz w:val="26"/>
+          <w:color w:val="1D4E89"/>
+          <w:sz w:val="25"/>
         </w:rPr>
         <w:t>The Real-Time Governance &amp; Kill-Switch Layer for Autonomous Financial Agents</w:t>
       </w:r>
     </w:p>
-    <w:p/>
-    <w:p>
-      <w:r>
-        <w:rPr>
-          <w:b/>
-          <w:sz w:val="21"/>
-        </w:rPr>
-        <w:t xml:space="preserve">Hackathon: </w:t>
-      </w:r>
-      <w:r>
-        <w:rPr>
-          <w:sz w:val="21"/>
-        </w:rPr>
-        <w:t>American Express CodeStreet 2026</w:t>
-      </w:r>
-    </w:p>
-    <w:p>
-      <w:r>
-        <w:rPr>
-          <w:b/>
-          <w:sz w:val="21"/>
-        </w:rPr>
-        <w:t xml:space="preserve">Problem Statement: </w:t>
-      </w:r>
-      <w:r>
-        <w:rPr>
-          <w:sz w:val="21"/>
-        </w:rPr>
-        <w:t>Governance Layer for Financial Agents</w:t>
-      </w:r>
-    </w:p>
-    <w:p>
-      <w:r>
-        <w:rPr>
-          <w:b/>
-          <w:sz w:val="21"/>
-        </w:rPr>
-        <w:t xml:space="preserve">Team: </w:t>
-      </w:r>
-      <w:r>
-        <w:rPr>
-          <w:sz w:val="21"/>
-        </w:rPr>
-        <w:t>[Team Name] — 3 Developers</w:t>
-      </w:r>
-    </w:p>
-    <w:p>
-      <w:r>
-        <w:rPr>
-          <w:b/>
-          <w:sz w:val="21"/>
-        </w:rPr>
-        <w:t xml:space="preserve">Submission Stage: </w:t>
-      </w:r>
-      <w:r>
-        <w:rPr>
-          <w:sz w:val="21"/>
-        </w:rPr>
-        <w:t>Round 1 — Idea &amp; Architecture</w:t>
-      </w:r>
-    </w:p>
-    <w:p/>
+    <w:tbl>
+      <w:tblPr>
+        <w:tblW w:type="auto" w:w="0"/>
+        <w:jc w:val="center"/>
+        <w:tblLayout w:type="fixed"/>
+        <w:tblLook w:firstColumn="1" w:firstRow="1" w:lastColumn="0" w:lastRow="0" w:noHBand="0" w:noVBand="1" w:val="04A0"/>
+      </w:tblPr>
+      <w:tblGrid>
+        <w:gridCol w:w="4824"/>
+        <w:gridCol w:w="4824"/>
+      </w:tblGrid>
+      <w:tr>
+        <w:tc>
+          <w:tcPr>
+            <w:tcW w:type="dxa" w:w="2592"/>
+            <w:shd w:val="clear" w:color="auto" w:fill="EDEFF3"/>
+          </w:tcPr>
+          <w:p>
+            <w:r/>
+            <w:r>
+              <w:rPr>
+                <w:b/>
+                <w:sz w:val="20"/>
+              </w:rPr>
+              <w:t>Hackathon</w:t>
+            </w:r>
+          </w:p>
+        </w:tc>
+        <w:tc>
+          <w:tcPr>
+            <w:tcW w:type="dxa" w:w="7056"/>
+          </w:tcPr>
+          <w:p>
+            <w:r/>
+            <w:r>
+              <w:rPr>
+                <w:sz w:val="20"/>
+              </w:rPr>
+              <w:t>American Express CodeStreet 2026</w:t>
+            </w:r>
+          </w:p>
+        </w:tc>
+      </w:tr>
+      <w:tr>
+        <w:tc>
+          <w:tcPr>
+            <w:tcW w:type="dxa" w:w="2592"/>
+            <w:shd w:val="clear" w:color="auto" w:fill="EDEFF3"/>
+          </w:tcPr>
+          <w:p>
+            <w:r/>
+            <w:r>
+              <w:rPr>
+                <w:b/>
+                <w:sz w:val="20"/>
+              </w:rPr>
+              <w:t>Problem Statement</w:t>
+            </w:r>
+          </w:p>
+        </w:tc>
+        <w:tc>
+          <w:tcPr>
+            <w:tcW w:type="dxa" w:w="7056"/>
+          </w:tcPr>
+          <w:p>
+            <w:r/>
+            <w:r>
+              <w:rPr>
+                <w:sz w:val="20"/>
+              </w:rPr>
+              <w:t>Governance Layer for Financial Agents</w:t>
+            </w:r>
+          </w:p>
+        </w:tc>
+      </w:tr>
+      <w:tr>
+        <w:tc>
+          <w:tcPr>
+            <w:tcW w:type="dxa" w:w="2592"/>
+            <w:shd w:val="clear" w:color="auto" w:fill="EDEFF3"/>
+          </w:tcPr>
+          <w:p>
+            <w:r/>
+            <w:r>
+              <w:rPr>
+                <w:b/>
+                <w:sz w:val="20"/>
+              </w:rPr>
+              <w:t>Team</w:t>
+            </w:r>
+          </w:p>
+        </w:tc>
+        <w:tc>
+          <w:tcPr>
+            <w:tcW w:type="dxa" w:w="7056"/>
+          </w:tcPr>
+          <w:p>
+            <w:r/>
+            <w:r>
+              <w:rPr>
+                <w:sz w:val="20"/>
+              </w:rPr>
+              <w:t>The Three Stack — Dev Upadhyay (Team Lead), Niti Kanoongo, Smit Shah</w:t>
+            </w:r>
+          </w:p>
+        </w:tc>
+      </w:tr>
+      <w:tr>
+        <w:tc>
+          <w:tcPr>
+            <w:tcW w:type="dxa" w:w="2592"/>
+            <w:shd w:val="clear" w:color="auto" w:fill="EDEFF3"/>
+          </w:tcPr>
+          <w:p>
+            <w:r/>
+            <w:r>
+              <w:rPr>
+                <w:b/>
+                <w:sz w:val="20"/>
+              </w:rPr>
+              <w:t>Submission Stage</w:t>
+            </w:r>
+          </w:p>
+        </w:tc>
+        <w:tc>
+          <w:tcPr>
+            <w:tcW w:type="dxa" w:w="7056"/>
+          </w:tcPr>
+          <w:p>
+            <w:r/>
+            <w:r>
+              <w:rPr>
+                <w:sz w:val="20"/>
+              </w:rPr>
+              <w:t>Round 1 — Idea &amp; Architecture</w:t>
+            </w:r>
+          </w:p>
+        </w:tc>
+      </w:tr>
+    </w:tbl>
     <w:p>
       <w:pPr>
-        <w:pBdr>
-          <w:bottom w:val="single" w:sz="8" w:space="1" w:color="0F7666"/>
-        </w:pBdr>
+        <w:spacing w:after="40"/>
       </w:pPr>
     </w:p>
     <w:p>
       <w:pPr>
-        <w:keepNext/>
-        <w:spacing w:before="400" w:after="160"/>
+        <w:pStyle w:val="Heading1"/>
+      </w:pPr>
+      <w:r>
+        <w:t>Evaluation Criteria Fit — At a Glance</w:t>
+      </w:r>
+    </w:p>
+    <w:p>
+      <w:pPr>
+        <w:spacing w:after="160"/>
+      </w:pPr>
+      <w:r>
+        <w:rPr>
+          <w:i w:val="0"/>
+        </w:rPr>
+        <w:t>Every section below maps back to one of Amex's four Round 1 criteria. This table is the map.</w:t>
+      </w:r>
+    </w:p>
+    <w:tbl>
+      <w:tblPr>
+        <w:tblW w:type="auto" w:w="0"/>
+        <w:tblLayout w:type="fixed"/>
+        <w:tblLook w:firstColumn="1" w:firstRow="1" w:lastColumn="0" w:lastRow="0" w:noHBand="0" w:noVBand="1" w:val="04A0"/>
+      </w:tblPr>
+      <w:tblGrid>
+        <w:gridCol w:w="4824"/>
+        <w:gridCol w:w="4824"/>
+      </w:tblGrid>
+      <w:tr>
+        <w:tc>
+          <w:tcPr>
+            <w:tcW w:type="dxa" w:w="2736"/>
+            <w:shd w:val="clear" w:color="auto" w:fill="0B1220"/>
+          </w:tcPr>
+          <w:p>
+            <w:r/>
+            <w:r>
+              <w:rPr>
+                <w:b/>
+                <w:color w:val="FFFFFF"/>
+                <w:sz w:val="19"/>
+              </w:rPr>
+              <w:t>Criterion</w:t>
+            </w:r>
+          </w:p>
+        </w:tc>
+        <w:tc>
+          <w:tcPr>
+            <w:tcW w:type="dxa" w:w="6912"/>
+            <w:shd w:val="clear" w:color="auto" w:fill="0B1220"/>
+          </w:tcPr>
+          <w:p>
+            <w:r/>
+            <w:r>
+              <w:rPr>
+                <w:b/>
+                <w:color w:val="FFFFFF"/>
+                <w:sz w:val="19"/>
+              </w:rPr>
+              <w:t>How AegisAgent Delivers</w:t>
+            </w:r>
+          </w:p>
+        </w:tc>
+      </w:tr>
+      <w:tr>
+        <w:tc>
+          <w:tcPr>
+            <w:tcW w:type="dxa" w:w="2736"/>
+            <w:shd w:val="clear" w:color="auto" w:fill="EDEFF3"/>
+          </w:tcPr>
+          <w:p>
+            <w:r/>
+            <w:r>
+              <w:rPr>
+                <w:b/>
+                <w:sz w:val="19"/>
+              </w:rPr>
+              <w:t>Relevance</w:t>
+            </w:r>
+          </w:p>
+        </w:tc>
+        <w:tc>
+          <w:tcPr>
+            <w:tcW w:type="dxa" w:w="6912"/>
+          </w:tcPr>
+          <w:p>
+            <w:r/>
+            <w:r>
+              <w:rPr>
+                <w:sz w:val="19"/>
+              </w:rPr>
+              <w:t>Implements all five capabilities named in the brief — permissions, spend caps, revocation, action log, emergency stop — as one cohesive system, not a subset (Sections 2–3).</w:t>
+            </w:r>
+          </w:p>
+        </w:tc>
+      </w:tr>
+      <w:tr>
+        <w:tc>
+          <w:tcPr>
+            <w:tcW w:type="dxa" w:w="2736"/>
+            <w:shd w:val="clear" w:color="auto" w:fill="EDEFF3"/>
+          </w:tcPr>
+          <w:p>
+            <w:r/>
+            <w:r>
+              <w:rPr>
+                <w:b/>
+                <w:sz w:val="19"/>
+              </w:rPr>
+              <w:t>Idea Articulation</w:t>
+            </w:r>
+          </w:p>
+        </w:tc>
+        <w:tc>
+          <w:tcPr>
+            <w:tcW w:type="dxa" w:w="6912"/>
+          </w:tcPr>
+          <w:p>
+            <w:r/>
+            <w:r>
+              <w:rPr>
+                <w:sz w:val="19"/>
+              </w:rPr>
+              <w:t>A fully specified request-to-decision data flow with exact enforcement order and failure behavior — no hand-waving about what happens when a check fails (Section 6).</w:t>
+            </w:r>
+          </w:p>
+        </w:tc>
+      </w:tr>
+      <w:tr>
+        <w:tc>
+          <w:tcPr>
+            <w:tcW w:type="dxa" w:w="2736"/>
+            <w:shd w:val="clear" w:color="auto" w:fill="EDEFF3"/>
+          </w:tcPr>
+          <w:p>
+            <w:r/>
+            <w:r>
+              <w:rPr>
+                <w:b/>
+                <w:sz w:val="19"/>
+              </w:rPr>
+              <w:t>Technical Solution &amp; Innovation</w:t>
+            </w:r>
+          </w:p>
+        </w:tc>
+        <w:tc>
+          <w:tcPr>
+            <w:tcW w:type="dxa" w:w="6912"/>
+          </w:tcPr>
+          <w:p>
+            <w:r/>
+            <w:r>
+              <w:rPr>
+                <w:sz w:val="19"/>
+              </w:rPr>
+              <w:t>Dual-layer zero-trust enforcement (policy and budget checked independently) plus an independently-verified NEAR AI TEE attestation, honestly scoped to what's actually provable versus mocked (Section 7).</w:t>
+            </w:r>
+          </w:p>
+        </w:tc>
+      </w:tr>
+      <w:tr>
+        <w:tc>
+          <w:tcPr>
+            <w:tcW w:type="dxa" w:w="2736"/>
+            <w:shd w:val="clear" w:color="auto" w:fill="EDEFF3"/>
+          </w:tcPr>
+          <w:p>
+            <w:r/>
+            <w:r>
+              <w:rPr>
+                <w:b/>
+                <w:sz w:val="19"/>
+              </w:rPr>
+              <w:t>Implementation &amp; Impact</w:t>
+            </w:r>
+          </w:p>
+        </w:tc>
+        <w:tc>
+          <w:tcPr>
+            <w:tcW w:type="dxa" w:w="6912"/>
+          </w:tcPr>
+          <w:p>
+            <w:r/>
+            <w:r>
+              <w:rPr>
+                <w:sz w:val="19"/>
+              </w:rPr>
+              <w:t>A running enforcement core, tested twice from a clean boot with real screenshots, not just a diagram — plus a stateless design that scales by adding replicas, not by redesign (Sections 9, 11).</w:t>
+            </w:r>
+          </w:p>
+        </w:tc>
+      </w:tr>
+    </w:tbl>
+    <w:p>
+      <w:pPr>
+        <w:spacing w:after="40"/>
+      </w:pPr>
+    </w:p>
+    <w:p>
+      <w:pPr>
+        <w:pStyle w:val="Heading1"/>
+      </w:pPr>
+      <w:r>
+        <w:t>1. Elevator Pitch</w:t>
+      </w:r>
+    </w:p>
+    <w:p>
+      <w:pPr>
+        <w:spacing w:after="120"/>
       </w:pPr>
       <w:r>
         <w:rPr>
           <w:b/>
-          <w:color w:val="0F7666"/>
-          <w:sz w:val="30"/>
-        </w:rPr>
-        <w:t>1. Elevator Pitch</w:t>
-      </w:r>
-    </w:p>
-    <w:p>
-      <w:r>
-        <w:rPr>
-          <w:b w:val="0"/>
-          <w:i/>
-          <w:color w:val="1A1A1A"/>
-          <w:sz w:val="22"/>
         </w:rPr>
         <w:t>AegisAgent is the control plane that lets American Express deploy fleets of autonomous financial agents without betting the bank on their good behavior — enforcing who an agent is, what it can spend, and how fast it can be stopped, on every single action, in under 10 milliseconds.</w:t>
       </w:r>
-    </w:p>
-    <w:p>
       <w:r>
         <w:rPr>
-          <w:b w:val="0"/>
           <w:i w:val="0"/>
-          <w:color w:val="1A1A1A"/>
-          <w:sz w:val="22"/>
         </w:rPr>
-        <w:t>As AI agents move from answering questions to initiating transfers, rebalancing portfolios, and filing claims, the risk shifts from “wrong answer” to “wrong action with real money.” AegisAgent is the safety infrastructure that sits between every autonomous agent and every banking system of record, so that autonomy never means loss of control.</w:t>
       </w:r>
     </w:p>
     <w:p>
       <w:pPr>
-        <w:keepNext/>
-        <w:spacing w:before="400" w:after="160"/>
+        <w:spacing w:after="120"/>
       </w:pPr>
       <w:r>
         <w:rPr>
           <w:b/>
-          <w:color w:val="0F7666"/>
-          <w:sz w:val="30"/>
         </w:rPr>
-        <w:t>2. Problem Alignment</w:t>
+        <w:t>As AI agents move from answering questions to initiating transfers, rebalancing portfolios, and filing claims, the risk shifts from “wrong answer” to “wrong action with real money.” AegisAgent is the safety infrastructure that sits between every autonomous agent and every banking system of record, so that autonomy never means loss of control.</w:t>
+      </w:r>
+      <w:r>
+        <w:rPr>
+          <w:i w:val="0"/>
+        </w:rPr>
       </w:r>
     </w:p>
     <w:p>
+      <w:pPr>
+        <w:pStyle w:val="Heading1"/>
+      </w:pPr>
+      <w:r>
+        <w:t>2. Problem Alignment (Relevance)</w:t>
+      </w:r>
+    </w:p>
+    <w:p>
+      <w:pPr>
+        <w:spacing w:after="120"/>
+      </w:pPr>
       <w:r>
         <w:rPr>
-          <w:b w:val="0"/>
+          <w:b/>
+        </w:rPr>
+        <w:t>Card Member and Merchant-facing agent challenges in this hackathon — dispute resolution, benefit activation, travel rebooking, end-to-end servicing — all share one unstated dependency: none of them are safe to deploy at scale without a governance layer underneath them. AegisAgent directly answers the brief for “Governance Layer for Financial Agents” by delivering the five required capabilities as a single, cohesive, production-shaped system:</w:t>
+      </w:r>
+      <w:r>
+        <w:rPr>
           <w:i w:val="0"/>
-          <w:color w:val="1A1A1A"/>
-          <w:sz w:val="22"/>
         </w:rPr>
-        <w:t>Card Member and Merchant-facing agent challenges in this hackathon — dispute resolution, benefit activation, travel rebooking, and end-to-end servicing — all share one unstated dependency: none of them are safe to deploy at scale without a governance layer underneath them. AegisAgent directly answers the brief for “Governance Layer for Financial Agents” by delivering the five required capabilities as a single, cohesive, production-shaped system:</w:t>
       </w:r>
     </w:p>
     <w:p>
       <w:pPr>
         <w:pStyle w:val="ListBullet"/>
+        <w:spacing w:after="80"/>
       </w:pPr>
       <w:r>
         <w:rPr>
@@ -179,6 +468,7 @@
     <w:p>
       <w:pPr>
         <w:pStyle w:val="ListBullet"/>
+        <w:spacing w:after="80"/>
       </w:pPr>
       <w:r>
         <w:rPr>
@@ -193,6 +483,7 @@
     <w:p>
       <w:pPr>
         <w:pStyle w:val="ListBullet"/>
+        <w:spacing w:after="80"/>
       </w:pPr>
       <w:r>
         <w:rPr>
@@ -207,6 +498,7 @@
     <w:p>
       <w:pPr>
         <w:pStyle w:val="ListBullet"/>
+        <w:spacing w:after="80"/>
       </w:pPr>
       <w:r>
         <w:rPr>
@@ -221,6 +513,7 @@
     <w:p>
       <w:pPr>
         <w:pStyle w:val="ListBullet"/>
+        <w:spacing w:after="80"/>
       </w:pPr>
       <w:r>
         <w:rPr>
@@ -234,764 +527,249 @@
     </w:p>
     <w:p>
       <w:pPr>
-        <w:keepNext/>
-        <w:spacing w:before="400" w:after="160"/>
+        <w:pStyle w:val="Heading1"/>
+      </w:pPr>
+      <w:r>
+        <w:t>3. Solution Overview</w:t>
+      </w:r>
+    </w:p>
+    <w:p>
+      <w:pPr>
+        <w:spacing w:after="120"/>
       </w:pPr>
       <w:r>
         <w:rPr>
           <w:b/>
-          <w:color w:val="0F7666"/>
-          <w:sz w:val="30"/>
-        </w:rPr>
-        <w:t>3. Solution Overview</w:t>
-      </w:r>
-    </w:p>
-    <w:p>
-      <w:r>
-        <w:rPr>
-          <w:b w:val="0"/>
-          <w:i w:val="0"/>
-          <w:color w:val="1A1A1A"/>
-          <w:sz w:val="22"/>
         </w:rPr>
         <w:t>AegisAgent is built as a mandatory proxy, not an optional safety net. Financial agents cannot reach a banking API directly — every request is physically routed through the Aegis Gateway, which evaluates identity, permissions, and budget before forwarding, blocking, or throttling the call. This “no side door” architecture is what separates AegisAgent from a monitoring dashboard bolted on after the fact: governance here is structural, not observational.</w:t>
       </w:r>
-    </w:p>
-    <w:p>
       <w:r>
         <w:rPr>
-          <w:b w:val="0"/>
           <w:i w:val="0"/>
-          <w:color w:val="1A1A1A"/>
-          <w:sz w:val="22"/>
         </w:rPr>
-        <w:t>The system has three cooperating layers: a financial agent fleet whose LLM reasoning calls run through NEAR AI Cloud's independently-verifiable TEE inference API (the agent orchestration layer itself is not a documented TEE product today, and is built with a clearly labeled, swappable mock), a zero-trust enforcement middleware that makes the allow/deny decision (Aegis Gateway + OPA + Redis), and an operator-facing control and audit plane (the Aegis Console).</w:t>
       </w:r>
     </w:p>
     <w:p>
       <w:pPr>
-        <w:keepNext/>
-        <w:spacing w:before="400" w:after="160"/>
+        <w:spacing w:after="120"/>
       </w:pPr>
       <w:r>
         <w:rPr>
           <w:b/>
-          <w:color w:val="0F7666"/>
-          <w:sz w:val="30"/>
         </w:rPr>
-        <w:t>4. Core Architecture</w:t>
+        <w:t>The system has three cooperating layers: a financial agent fleet whose LLM reasoning calls run through NEAR AI Cloud's independently-verifiable TEE inference API (the agent orchestration layer itself is not a documented TEE product today, and is built with a clearly labeled, swappable mock), a zero-trust enforcement middleware that makes the allow/deny decision (Aegis Gateway + OPA + Redis), and an operator-facing control and audit plane (the Aegis Console).</w:t>
       </w:r>
-    </w:p>
-    <w:tbl>
-      <w:tblPr>
-        <w:tblStyle w:val="TableGrid"/>
-        <w:tblW w:type="auto" w:w="0"/>
-        <w:jc w:val="center"/>
-        <w:tblLook w:firstColumn="1" w:firstRow="1" w:lastColumn="0" w:lastRow="0" w:noHBand="0" w:noVBand="1" w:val="04A0"/>
-      </w:tblPr>
-      <w:tblGrid>
-        <w:gridCol w:w="2340"/>
-        <w:gridCol w:w="2340"/>
-        <w:gridCol w:w="2340"/>
-        <w:gridCol w:w="2340"/>
-      </w:tblGrid>
-      <w:tr>
-        <w:tc>
-          <w:tcPr>
-            <w:tcW w:type="dxa" w:w="2340"/>
-            <w:shd w:fill="0B1220"/>
-          </w:tcPr>
-          <w:p>
-            <w:r>
-              <w:rPr>
-                <w:b/>
-                <w:color w:val="FFFFFF"/>
-                <w:sz w:val="19"/>
-              </w:rPr>
-              <w:t>Layer</w:t>
-            </w:r>
-          </w:p>
-        </w:tc>
-        <w:tc>
-          <w:tcPr>
-            <w:tcW w:type="dxa" w:w="2340"/>
-            <w:shd w:fill="0B1220"/>
-          </w:tcPr>
-          <w:p>
-            <w:r>
-              <w:rPr>
-                <w:b/>
-                <w:color w:val="FFFFFF"/>
-                <w:sz w:val="19"/>
-              </w:rPr>
-              <w:t>Component</w:t>
-            </w:r>
-          </w:p>
-        </w:tc>
-        <w:tc>
-          <w:tcPr>
-            <w:tcW w:type="dxa" w:w="2340"/>
-            <w:shd w:fill="0B1220"/>
-          </w:tcPr>
-          <w:p>
-            <w:r>
-              <w:rPr>
-                <w:b/>
-                <w:color w:val="FFFFFF"/>
-                <w:sz w:val="19"/>
-              </w:rPr>
-              <w:t>Technology</w:t>
-            </w:r>
-          </w:p>
-        </w:tc>
-        <w:tc>
-          <w:tcPr>
-            <w:tcW w:type="dxa" w:w="2340"/>
-            <w:shd w:fill="0B1220"/>
-          </w:tcPr>
-          <w:p>
-            <w:r>
-              <w:rPr>
-                <w:b/>
-                <w:color w:val="FFFFFF"/>
-                <w:sz w:val="19"/>
-              </w:rPr>
-              <w:t>Function</w:t>
-            </w:r>
-          </w:p>
-        </w:tc>
-      </w:tr>
-      <w:tr>
-        <w:tc>
-          <w:tcPr>
-            <w:tcW w:type="dxa" w:w="2340"/>
-          </w:tcPr>
-          <w:p>
-            <w:r>
-              <w:rPr>
-                <w:sz w:val="19"/>
-              </w:rPr>
-              <w:t>Agent Runtime</w:t>
-            </w:r>
-          </w:p>
-        </w:tc>
-        <w:tc>
-          <w:tcPr>
-            <w:tcW w:type="dxa" w:w="2340"/>
-          </w:tcPr>
-          <w:p>
-            <w:r>
-              <w:rPr>
-                <w:sz w:val="19"/>
-              </w:rPr>
-              <w:t>Financial Agent Fleet</w:t>
-            </w:r>
-          </w:p>
-        </w:tc>
-        <w:tc>
-          <w:tcPr>
-            <w:tcW w:type="dxa" w:w="2340"/>
-          </w:tcPr>
-          <w:p>
-            <w:r>
-              <w:rPr>
-                <w:sz w:val="19"/>
-              </w:rPr>
-              <w:t>NEAR AI Cloud (Intel TDX + NVIDIA TEE) for LLM inference; agent orchestration layer runs separately (mocked/labeled, per verified findings)</w:t>
-            </w:r>
-          </w:p>
-        </w:tc>
-        <w:tc>
-          <w:tcPr>
-            <w:tcW w:type="dxa" w:w="2340"/>
-          </w:tcPr>
-          <w:p>
-            <w:r>
-              <w:rPr>
-                <w:sz w:val="19"/>
-              </w:rPr>
-              <w:t>Agents' LLM reasoning calls route through NEAR AI Cloud's attested inference API (independently verifiable); orchestration logic is not a documented TEE product today, so it runs outside a TEE with a clearly labeled mock</w:t>
-            </w:r>
-          </w:p>
-        </w:tc>
-      </w:tr>
-      <w:tr>
-        <w:tc>
-          <w:tcPr>
-            <w:tcW w:type="dxa" w:w="2340"/>
-          </w:tcPr>
-          <w:p>
-            <w:r>
-              <w:rPr>
-                <w:sz w:val="19"/>
-              </w:rPr>
-              <w:t>Enforcement</w:t>
-            </w:r>
-          </w:p>
-        </w:tc>
-        <w:tc>
-          <w:tcPr>
-            <w:tcW w:type="dxa" w:w="2340"/>
-          </w:tcPr>
-          <w:p>
-            <w:r>
-              <w:rPr>
-                <w:sz w:val="19"/>
-              </w:rPr>
-              <w:t>Aegis Gateway Proxy</w:t>
-            </w:r>
-          </w:p>
-        </w:tc>
-        <w:tc>
-          <w:tcPr>
-            <w:tcW w:type="dxa" w:w="2340"/>
-          </w:tcPr>
-          <w:p>
-            <w:r>
-              <w:rPr>
-                <w:sz w:val="19"/>
-              </w:rPr>
-              <w:t>FastAPI (Python) interceptor</w:t>
-            </w:r>
-          </w:p>
-        </w:tc>
-        <w:tc>
-          <w:tcPr>
-            <w:tcW w:type="dxa" w:w="2340"/>
-          </w:tcPr>
-          <w:p>
-            <w:r>
-              <w:rPr>
-                <w:sz w:val="19"/>
-              </w:rPr>
-              <w:t>Sits in front of every banking API call; the only path an agent action can take</w:t>
-            </w:r>
-          </w:p>
-        </w:tc>
-      </w:tr>
-      <w:tr>
-        <w:tc>
-          <w:tcPr>
-            <w:tcW w:type="dxa" w:w="2340"/>
-          </w:tcPr>
-          <w:p>
-            <w:r>
-              <w:rPr>
-                <w:sz w:val="19"/>
-              </w:rPr>
-              <w:t>Policy</w:t>
-            </w:r>
-          </w:p>
-        </w:tc>
-        <w:tc>
-          <w:tcPr>
-            <w:tcW w:type="dxa" w:w="2340"/>
-          </w:tcPr>
-          <w:p>
-            <w:r>
-              <w:rPr>
-                <w:sz w:val="19"/>
-              </w:rPr>
-              <w:t>Zero-Trust Policy Engine</w:t>
-            </w:r>
-          </w:p>
-        </w:tc>
-        <w:tc>
-          <w:tcPr>
-            <w:tcW w:type="dxa" w:w="2340"/>
-          </w:tcPr>
-          <w:p>
-            <w:r>
-              <w:rPr>
-                <w:sz w:val="19"/>
-              </w:rPr>
-              <w:t>Open Policy Agent (Rego), role-based (RBAC) today</w:t>
-            </w:r>
-          </w:p>
-        </w:tc>
-        <w:tc>
-          <w:tcPr>
-            <w:tcW w:type="dxa" w:w="2340"/>
-          </w:tcPr>
-          <w:p>
-            <w:r>
-              <w:rPr>
-                <w:sz w:val="19"/>
-              </w:rPr>
-              <w:t>Evaluates role and action per request in single-digit milliseconds, deny by default</w:t>
-            </w:r>
-          </w:p>
-        </w:tc>
-      </w:tr>
-      <w:tr>
-        <w:tc>
-          <w:tcPr>
-            <w:tcW w:type="dxa" w:w="2340"/>
-          </w:tcPr>
-          <w:p>
-            <w:r>
-              <w:rPr>
-                <w:sz w:val="19"/>
-              </w:rPr>
-              <w:t>Budget</w:t>
-            </w:r>
-          </w:p>
-        </w:tc>
-        <w:tc>
-          <w:tcPr>
-            <w:tcW w:type="dxa" w:w="2340"/>
-          </w:tcPr>
-          <w:p>
-            <w:r>
-              <w:rPr>
-                <w:sz w:val="19"/>
-              </w:rPr>
-              <w:t>Dynamic Spend Cap Engine</w:t>
-            </w:r>
-          </w:p>
-        </w:tc>
-        <w:tc>
-          <w:tcPr>
-            <w:tcW w:type="dxa" w:w="2340"/>
-          </w:tcPr>
-          <w:p>
-            <w:r>
-              <w:rPr>
-                <w:sz w:val="19"/>
-              </w:rPr>
-              <w:t>Redis (atomic INCRBYFLOAT, Lua scripts)</w:t>
-            </w:r>
-          </w:p>
-        </w:tc>
-        <w:tc>
-          <w:tcPr>
-            <w:tcW w:type="dxa" w:w="2340"/>
-          </w:tcPr>
-          <w:p>
-            <w:r>
-              <w:rPr>
-                <w:sz w:val="19"/>
-              </w:rPr>
-              <w:t>Enforces per-agent and fleet-wide dollar/token limits in real time</w:t>
-            </w:r>
-          </w:p>
-        </w:tc>
-      </w:tr>
-      <w:tr>
-        <w:tc>
-          <w:tcPr>
-            <w:tcW w:type="dxa" w:w="2340"/>
-          </w:tcPr>
-          <w:p>
-            <w:r>
-              <w:rPr>
-                <w:sz w:val="19"/>
-              </w:rPr>
-              <w:t>Control</w:t>
-            </w:r>
-          </w:p>
-        </w:tc>
-        <w:tc>
-          <w:tcPr>
-            <w:tcW w:type="dxa" w:w="2340"/>
-          </w:tcPr>
-          <w:p>
-            <w:r>
-              <w:rPr>
-                <w:sz w:val="19"/>
-              </w:rPr>
-              <w:t>Revocation &amp; Kill-Switch Service</w:t>
-            </w:r>
-          </w:p>
-        </w:tc>
-        <w:tc>
-          <w:tcPr>
-            <w:tcW w:type="dxa" w:w="2340"/>
-          </w:tcPr>
-          <w:p>
-            <w:r>
-              <w:rPr>
-                <w:sz w:val="19"/>
-              </w:rPr>
-              <w:t>WebSocket + Redis Pub/Sub</w:t>
-            </w:r>
-          </w:p>
-        </w:tc>
-        <w:tc>
-          <w:tcPr>
-            <w:tcW w:type="dxa" w:w="2340"/>
-          </w:tcPr>
-          <w:p>
-            <w:r>
-              <w:rPr>
-                <w:sz w:val="19"/>
-              </w:rPr>
-              <w:t>Propagates instant revocation or full fleet emergency-stop to every open agent connection</w:t>
-            </w:r>
-          </w:p>
-        </w:tc>
-      </w:tr>
-      <w:tr>
-        <w:tc>
-          <w:tcPr>
-            <w:tcW w:type="dxa" w:w="2340"/>
-          </w:tcPr>
-          <w:p>
-            <w:r>
-              <w:rPr>
-                <w:sz w:val="19"/>
-              </w:rPr>
-              <w:t>Audit</w:t>
-            </w:r>
-          </w:p>
-        </w:tc>
-        <w:tc>
-          <w:tcPr>
-            <w:tcW w:type="dxa" w:w="2340"/>
-          </w:tcPr>
-          <w:p>
-            <w:r>
-              <w:rPr>
-                <w:sz w:val="19"/>
-              </w:rPr>
-              <w:t>Immutable Ledger</w:t>
-            </w:r>
-          </w:p>
-        </w:tc>
-        <w:tc>
-          <w:tcPr>
-            <w:tcW w:type="dxa" w:w="2340"/>
-          </w:tcPr>
-          <w:p>
-            <w:r>
-              <w:rPr>
-                <w:sz w:val="19"/>
-              </w:rPr>
-              <w:t>PostgreSQL, hash-chained log entries</w:t>
-            </w:r>
-          </w:p>
-        </w:tc>
-        <w:tc>
-          <w:tcPr>
-            <w:tcW w:type="dxa" w:w="2340"/>
-          </w:tcPr>
-          <w:p>
-            <w:r>
-              <w:rPr>
-                <w:sz w:val="19"/>
-              </w:rPr>
-              <w:t>Tamper-evident record of every allow/deny decision with full policy reasoning</w:t>
-            </w:r>
-          </w:p>
-        </w:tc>
-      </w:tr>
-      <w:tr>
-        <w:tc>
-          <w:tcPr>
-            <w:tcW w:type="dxa" w:w="2340"/>
-          </w:tcPr>
-          <w:p>
-            <w:r>
-              <w:rPr>
-                <w:sz w:val="19"/>
-              </w:rPr>
-              <w:t>Observability</w:t>
-            </w:r>
-          </w:p>
-        </w:tc>
-        <w:tc>
-          <w:tcPr>
-            <w:tcW w:type="dxa" w:w="2340"/>
-          </w:tcPr>
-          <w:p>
-            <w:r>
-              <w:rPr>
-                <w:sz w:val="19"/>
-              </w:rPr>
-              <w:t>Telemetry Pipeline</w:t>
-            </w:r>
-          </w:p>
-        </w:tc>
-        <w:tc>
-          <w:tcPr>
-            <w:tcW w:type="dxa" w:w="2340"/>
-          </w:tcPr>
-          <w:p>
-            <w:r>
-              <w:rPr>
-                <w:sz w:val="19"/>
-              </w:rPr>
-              <w:t>Client-measured latency today; Prometheus/Grafana planned</w:t>
-            </w:r>
-          </w:p>
-        </w:tc>
-        <w:tc>
-          <w:tcPr>
-            <w:tcW w:type="dxa" w:w="2340"/>
-          </w:tcPr>
-          <w:p>
-            <w:r>
-              <w:rPr>
-                <w:sz w:val="19"/>
-              </w:rPr>
-              <w:t>Streams round-trip and, in Round 2, server-side enforcement metrics to the operator dashboard</w:t>
-            </w:r>
-          </w:p>
-        </w:tc>
-      </w:tr>
-      <w:tr>
-        <w:tc>
-          <w:tcPr>
-            <w:tcW w:type="dxa" w:w="2340"/>
-          </w:tcPr>
-          <w:p>
-            <w:r>
-              <w:rPr>
-                <w:sz w:val="19"/>
-              </w:rPr>
-              <w:t>Interface</w:t>
-            </w:r>
-          </w:p>
-        </w:tc>
-        <w:tc>
-          <w:tcPr>
-            <w:tcW w:type="dxa" w:w="2340"/>
-          </w:tcPr>
-          <w:p>
-            <w:r>
-              <w:rPr>
-                <w:sz w:val="19"/>
-              </w:rPr>
-              <w:t>Aegis Operator Console</w:t>
-            </w:r>
-          </w:p>
-        </w:tc>
-        <w:tc>
-          <w:tcPr>
-            <w:tcW w:type="dxa" w:w="2340"/>
-          </w:tcPr>
-          <w:p>
-            <w:r>
-              <w:rPr>
-                <w:sz w:val="19"/>
-              </w:rPr>
-              <w:t>Next.js, Tailwind, WebSockets</w:t>
-            </w:r>
-          </w:p>
-        </w:tc>
-        <w:tc>
-          <w:tcPr>
-            <w:tcW w:type="dxa" w:w="2340"/>
-          </w:tcPr>
-          <w:p>
-            <w:r>
-              <w:rPr>
-                <w:sz w:val="19"/>
-              </w:rPr>
-              <w:t>Live fleet view, policy view, spend-cap editor, audit stream, and one-click kill switch</w:t>
-            </w:r>
-          </w:p>
-        </w:tc>
-      </w:tr>
-    </w:tbl>
-    <w:p/>
-    <w:p>
       <w:r>
         <w:rPr>
-          <w:b w:val="0"/>
-          <w:i/>
-          <w:color w:val="555555"/>
-          <w:sz w:val="19"/>
+          <w:i w:val="0"/>
         </w:rPr>
-        <w:t>Corrected from the original architecture note for accuracy: the gateway is FastAPI/Python (not Go), the console is Next.js (not a Vite build), and the policy engine implements role-based access control today rather than full Cedar-style ABAC — see Section 5.1 and Section 10 for exactly what's built versus planned.</w:t>
       </w:r>
     </w:p>
     <w:p>
       <w:pPr>
-        <w:keepNext/>
-        <w:spacing w:before="400" w:after="160"/>
+        <w:pStyle w:val="Heading1"/>
+      </w:pPr>
+      <w:r>
+        <w:t>4. Core Architecture</w:t>
+      </w:r>
+    </w:p>
+    <w:p>
+      <w:pPr>
+        <w:spacing w:after="120"/>
       </w:pPr>
       <w:r>
         <w:rPr>
           <w:b/>
-          <w:color w:val="0F7666"/>
-          <w:sz w:val="30"/>
         </w:rPr>
-        <w:t>5. Key Features</w:t>
+        <w:t>Agent Fleet → Aegis Gateway Proxy (mandatory interceptor) → OPA policy check + Redis budget check → Banking Execution API. Every outcome writes to the Audit Ledger and streams to the Operator Console; an Emergency Stop can interrupt this path at any node, at any time. The gateway is FastAPI (Python); the console is Next.js; the policy engine implements role-based access control today, with attribute-based refinement scoped for Round 2 — see Sections 5.1 and 13 for exactly what's built versus planned.</w:t>
+      </w:r>
+      <w:r>
+        <w:rPr>
+          <w:i w:val="0"/>
+        </w:rPr>
       </w:r>
     </w:p>
     <w:p>
       <w:pPr>
-        <w:keepNext/>
-        <w:spacing w:before="240" w:after="80"/>
+        <w:pStyle w:val="Heading1"/>
+      </w:pPr>
+      <w:r>
+        <w:t>5. Key Features (Idea Articulation &amp; Technical Solution)</w:t>
+      </w:r>
+    </w:p>
+    <w:p>
+      <w:pPr>
+        <w:pStyle w:val="Heading2"/>
+      </w:pPr>
+      <w:r>
+        <w:t>5.1 Granular Role-Based Permissioning (RBAC), Extensible to Attributes</w:t>
+      </w:r>
+    </w:p>
+    <w:p>
+      <w:pPr>
+        <w:spacing w:after="120"/>
       </w:pPr>
       <w:r>
         <w:rPr>
           <w:b/>
-          <w:color w:val="0B1220"/>
-          <w:sz w:val="25"/>
-        </w:rPr>
-        <w:t>5.1 Granular Role-Based Permissioning (RBAC), Extensible to Attributes</w:t>
-      </w:r>
-    </w:p>
-    <w:p>
-      <w:r>
-        <w:rPr>
-          <w:b w:val="0"/>
-          <w:i w:val="0"/>
-          <w:color w:val="1A1A1A"/>
-          <w:sz w:val="22"/>
         </w:rPr>
         <w:t>Each agent is issued a scoped identity — today a role (Wealth Advisory, Trading, Servicing); a production deployment would layer on attributes such as risk tier, jurisdiction, and account scope. Rego policies in OPA evaluate every action request (trade_equity, transfer_funds, fetch_account_data, issue_refund) against that identity in real time. Nothing is permitted by default; every capability is an explicit grant.</w:t>
       </w:r>
-    </w:p>
-    <w:p>
       <w:r>
         <w:rPr>
-          <w:b w:val="0"/>
-          <w:i/>
-          <w:color w:val="555555"/>
-          <w:sz w:val="19"/>
+          <w:i w:val="0"/>
         </w:rPr>
-        <w:t>What's implemented today is role → action matching, deny-by-default, verified by an automated test suite. Attribute-based refinement (risk tier, jurisdiction, account scope) is a natural Round 2 / production extension of the same OPA policy, not a separate system — see Section 10.</w:t>
       </w:r>
     </w:p>
     <w:p>
       <w:pPr>
-        <w:keepNext/>
-        <w:spacing w:before="240" w:after="80"/>
+        <w:spacing w:after="120"/>
       </w:pPr>
       <w:r>
         <w:rPr>
           <w:b/>
-          <w:color w:val="0B1220"/>
-          <w:sz w:val="25"/>
         </w:rPr>
+        <w:t>What's implemented today is role → action matching, deny-by-default, verified by an automated test suite. Attribute-based refinement is a natural Round 2 extension of the same OPA policy, not a separate system.</w:t>
+      </w:r>
+      <w:r>
+        <w:rPr>
+          <w:i w:val="0"/>
+        </w:rPr>
+      </w:r>
+    </w:p>
+    <w:p>
+      <w:pPr>
+        <w:pStyle w:val="Heading2"/>
+      </w:pPr>
+      <w:r>
         <w:t>5.2 Dynamic Spend Caps &amp; Budget Engine</w:t>
       </w:r>
     </w:p>
     <w:p>
+      <w:pPr>
+        <w:spacing w:after="120"/>
+      </w:pPr>
       <w:r>
         <w:rPr>
-          <w:b w:val="0"/>
-          <w:i w:val="0"/>
-          <w:color w:val="1A1A1A"/>
-          <w:sz w:val="22"/>
+          <w:b/>
         </w:rPr>
         <w:t>Redis maintains live counters per agent, per action type, and per fleet, using atomic INCRBYFLOAT and Lua scripting so concurrent requests can never race past a limit. Caps are hot-reloadable from the operator console — an operator can tighten a budget mid-session and every subsequent request is evaluated against the new ceiling with no agent restart required.</w:t>
+      </w:r>
+      <w:r>
+        <w:rPr>
+          <w:i w:val="0"/>
+        </w:rPr>
       </w:r>
     </w:p>
     <w:p>
       <w:pPr>
-        <w:keepNext/>
-        <w:spacing w:before="240" w:after="80"/>
+        <w:pStyle w:val="Heading2"/>
+      </w:pPr>
+      <w:r>
+        <w:t>5.3 Instant Revocation &amp; Fleet-Wide Emergency Stop</w:t>
+      </w:r>
+    </w:p>
+    <w:p>
+      <w:pPr>
+        <w:spacing w:after="120"/>
       </w:pPr>
       <w:r>
         <w:rPr>
           <w:b/>
-          <w:color w:val="0B1220"/>
-          <w:sz w:val="25"/>
         </w:rPr>
-        <w:t>5.3 Instant Revocation &amp; Fleet-Wide Emergency Stop</w:t>
+        <w:t>A WebSocket-based control channel, backed by Redis Pub/Sub, lets an operator revoke a single agent's credentials or trigger a fleet-wide kill switch. The signal propagates to every open connection and every in-flight middleware check simultaneously — no polling delay, no agent needing to “check in” to learn it has been stopped.</w:t>
       </w:r>
-    </w:p>
-    <w:p>
       <w:r>
         <w:rPr>
-          <w:b w:val="0"/>
           <w:i w:val="0"/>
-          <w:color w:val="1A1A1A"/>
-          <w:sz w:val="22"/>
         </w:rPr>
-        <w:t>A WebSocket-based control channel, backed by Redis Pub/Sub, lets an operator revoke a single agent's credentials or trigger a fleet-wide kill switch. The signal propagates to every open connection and every in-flight middleware check simultaneously — no polling delay, no agent needing to “check in” to learn it has been stopped.</w:t>
       </w:r>
     </w:p>
     <w:p>
       <w:pPr>
-        <w:keepNext/>
-        <w:spacing w:before="240" w:after="80"/>
+        <w:pStyle w:val="Heading2"/>
+      </w:pPr>
+      <w:r>
+        <w:t>5.4 Operator Dashboard &amp; Immutable Audit Log</w:t>
+      </w:r>
+    </w:p>
+    <w:p>
+      <w:pPr>
+        <w:spacing w:after="120"/>
       </w:pPr>
       <w:r>
         <w:rPr>
           <w:b/>
-          <w:color w:val="0B1220"/>
-          <w:sz w:val="25"/>
         </w:rPr>
-        <w:t>5.4 Operator Dashboard &amp; Immutable Audit Log</w:t>
+        <w:t>Every decision — allowed, denied, or throttled — is written to a PostgreSQL ledger where each entry stores the hash of the previous entry, forming a hash-linked chain. Any retroactive edit breaks the chain and is immediately detectable, giving Amex a cryptographically verifiable record for compliance and post-incident review, streamed live to the console.</w:t>
       </w:r>
-    </w:p>
-    <w:p>
       <w:r>
         <w:rPr>
-          <w:b w:val="0"/>
           <w:i w:val="0"/>
-          <w:color w:val="1A1A1A"/>
-          <w:sz w:val="22"/>
         </w:rPr>
-        <w:t>Every decision — allowed, denied, or throttled — is written to a PostgreSQL ledger where each entry stores the hash of the previous entry, forming a hash-linked chain. Any retroactive edit breaks the chain and is immediately detectable, giving Amex a cryptographically verifiable record for compliance and post-incident review, streamed live to the console alongside round-trip latency metrics.</w:t>
       </w:r>
     </w:p>
     <w:p>
       <w:pPr>
-        <w:keepNext/>
-        <w:spacing w:before="240" w:after="80"/>
+        <w:pStyle w:val="Heading2"/>
+      </w:pPr>
+      <w:r>
+        <w:t>5.5 Low-Latency, Horizontally Scalable Middleware</w:t>
+      </w:r>
+    </w:p>
+    <w:p>
+      <w:pPr>
+        <w:spacing w:after="120"/>
       </w:pPr>
       <w:r>
         <w:rPr>
           <w:b/>
-          <w:color w:val="0B1220"/>
-          <w:sz w:val="25"/>
         </w:rPr>
-        <w:t>5.5 Low-Latency Middleware / Proxy Architecture</w:t>
+        <w:t>The enforcement path is designed to add single-digit-millisecond overhead: policy decisions are evaluated against an in-memory OPA bundle, spend checks are single Redis round-trips, and the proxy is stateless — all fleet and ledger state lives in Redis and PostgreSQL, not in the gateway process. Governance is engineered to be invisible to a well-behaved agent and instantaneous against a misbehaving one.</w:t>
       </w:r>
-    </w:p>
-    <w:p>
       <w:r>
         <w:rPr>
-          <w:b w:val="0"/>
           <w:i w:val="0"/>
-          <w:color w:val="1A1A1A"/>
-          <w:sz w:val="22"/>
         </w:rPr>
-        <w:t>The enforcement path is designed to add single-digit-millisecond overhead: policy decisions are evaluated against an in-memory OPA bundle, spend checks are single Redis round-trips, and the proxy is stateless and horizontally scalable — all fleet and ledger state lives in Redis and PostgreSQL, not in the gateway process, so running more gateway replicas behind a load balancer is the whole scaling story. The kill-switch fan-out already assumes multiple replicas: events relay through Redis Pub/Sub rather than being pushed in-process, so a console attached to any replica sees every decision. Governance is engineered to be invisible to a well-behaved agent and instantaneous against a misbehaving one.</w:t>
       </w:r>
     </w:p>
     <w:p>
       <w:pPr>
-        <w:keepNext/>
-        <w:spacing w:before="400" w:after="160"/>
+        <w:pStyle w:val="Heading1"/>
+      </w:pPr>
+      <w:r>
+        <w:t>6. Technical Architecture &amp; Data Flow</w:t>
+      </w:r>
+    </w:p>
+    <w:p>
+      <w:pPr>
+        <w:spacing w:after="80"/>
       </w:pPr>
       <w:r>
         <w:rPr>
           <w:b/>
-          <w:color w:val="0F7666"/>
-          <w:sz w:val="30"/>
         </w:rPr>
-        <w:t>6. Technical Architecture &amp; Data Flow</w:t>
+        <w:t>The end-to-end request path is:</w:t>
       </w:r>
-    </w:p>
-    <w:p>
       <w:r>
         <w:rPr>
-          <w:b w:val="0"/>
           <w:i w:val="0"/>
-          <w:color w:val="1A1A1A"/>
-          <w:sz w:val="22"/>
         </w:rPr>
-        <w:t>The end-to-end request path is:</w:t>
       </w:r>
     </w:p>
     <w:p>
       <w:pPr>
         <w:pStyle w:val="ListBullet"/>
+        <w:spacing w:after="80"/>
       </w:pPr>
       <w:r>
-        <w:t>A Financial Agent (Wealth Advisory, High-Frequency Trader, or Rogue/Anomaly test agent) constructs an action request. Its LLM reasoning call is made through NEAR AI Cloud's attested TEE inference layer (independently verifiable); the agent's own orchestration identity is asserted by our gateway-issued credential, not a NEAR AI TEE attestation, since that layer is not a documented TEE product today.</w:t>
+        <w:t>A Financial Agent (Wealth Advisory, High-Frequency Trader, or Rogue/Anomaly test agent) constructs an action request. Its LLM reasoning call is made through NEAR AI Cloud's attested TEE inference layer; the agent's own orchestration identity is asserted by our gateway-issued credential, not a NEAR AI TEE attestation, since that layer is not a documented TEE product today.</w:t>
       </w:r>
     </w:p>
     <w:p>
       <w:pPr>
         <w:pStyle w:val="ListBullet"/>
+        <w:spacing w:after="80"/>
       </w:pPr>
       <w:r>
         <w:t>The request is sent exclusively to the Aegis Gateway Proxy — there is no alternate path to a banking API.</w:t>
@@ -1000,14 +778,16 @@
     <w:p>
       <w:pPr>
         <w:pStyle w:val="ListBullet"/>
+        <w:spacing w:after="80"/>
       </w:pPr>
       <w:r>
-        <w:t>The Gateway checks revocation first, then calls the Zero-Trust Policy Engine (OPA) for a role/action decision, then — only if permitted — checks the Dynamic Spend Cap Engine (Redis) for budget headroom. The order is deliberate and sequential, not parallel: revocation is cheapest to check and stops a killed agent without consulting policy at all, and the spend cap runs last so a denied action never consumes budget.</w:t>
+        <w:t>The Gateway checks revocation first, then the Policy Engine (OPA) for a role/action decision, then — only if permitted — the Spend Cap Engine (Redis) for budget headroom. The order is deliberate: revocation is cheapest and stops a killed agent without consulting policy at all; the spend cap runs last so a denied action never consumes budget.</w:t>
       </w:r>
     </w:p>
     <w:p>
       <w:pPr>
         <w:pStyle w:val="ListBullet"/>
+        <w:spacing w:after="80"/>
       </w:pPr>
       <w:r>
         <w:t>If all checks pass, the request is forwarded to the downstream Banking Execution API; if any fails, the request is blocked and a denial reason is generated.</w:t>
@@ -1016,47 +796,33 @@
     <w:p>
       <w:pPr>
         <w:pStyle w:val="ListBullet"/>
+        <w:spacing w:after="80"/>
       </w:pPr>
       <w:r>
-        <w:t>Every outcome — allow or deny — is written to the Immutable Audit Ledger and pushed over WebSocket to the Aegis Operator Console in real time.</w:t>
+        <w:t>Every outcome is written to the Immutable Audit Ledger and pushed over WebSocket to the Aegis Operator Console in real time.</w:t>
       </w:r>
     </w:p>
     <w:p>
       <w:pPr>
         <w:pStyle w:val="ListBullet"/>
+        <w:spacing w:after="80"/>
       </w:pPr>
       <w:r>
-        <w:t>At any point, an operator can issue a Revocation or Emergency Stop event, which is broadcast via Redis Pub/Sub and enforced at the Gateway before any further agent action is evaluated.</w:t>
+        <w:t>At any point, an operator can issue a Revocation or Emergency Stop event, broadcast via Redis Pub/Sub and enforced at the Gateway before any further agent action is evaluated.</w:t>
       </w:r>
     </w:p>
     <w:p>
       <w:pPr>
-        <w:keepNext/>
-        <w:spacing w:before="400" w:after="160"/>
+        <w:pStyle w:val="Heading1"/>
       </w:pPr>
       <w:r>
-        <w:rPr>
-          <w:b/>
-          <w:color w:val="0F7666"/>
-          <w:sz w:val="30"/>
-        </w:rPr>
-        <w:t>7. Innovation &amp; Differentiators</w:t>
-      </w:r>
-    </w:p>
-    <w:p>
-      <w:r>
-        <w:rPr>
-          <w:b w:val="0"/>
-          <w:i w:val="0"/>
-          <w:color w:val="1A1A1A"/>
-          <w:sz w:val="22"/>
-        </w:rPr>
-        <w:t>Four design choices separate AegisAgent from a conventional CRUD-based permissions dashboard:</w:t>
+        <w:t>7. Innovation &amp; Differentiators (Technical Solution &amp; Innovation)</w:t>
       </w:r>
     </w:p>
     <w:p>
       <w:pPr>
         <w:pStyle w:val="ListBullet"/>
+        <w:spacing w:after="80"/>
       </w:pPr>
       <w:r>
         <w:rPr>
@@ -1065,12 +831,13 @@
         <w:t xml:space="preserve">Verifiable Execution, Honestly Scoped — </w:t>
       </w:r>
       <w:r>
-        <w:t>Our agents' LLM reasoning calls run through NEAR AI Cloud's real, independently-verifiable TEE inference layer (Intel TDX confidential VMs plus NVIDIA GPU TEE) — every response carries a hardware-signed attestation checkable against NVIDIA's and Intel's own verification services, no vendor claim required. The agent orchestration layer itself is not a documented TEE-hosted product from NEAR AI today, so we built that piece with a clearly labeled, swappable mock instead of repeating an unverified claim. We checked this against NEAR AI's technical docs ourselves rather than their marketing copy, and can show a judge exactly what's cryptographically provable versus simulated — a distinction most teams claiming “runs in a TEE” won't survive being asked about.</w:t>
+        <w:t>Our agents' LLM reasoning calls run through NEAR AI Cloud's real, independently-verifiable TEE inference layer (Intel TDX confidential VMs plus NVIDIA GPU TEE) — every response carries a hardware-signed attestation checkable against NVIDIA's and Intel's own verification services. The agent orchestration layer itself is not a documented TEE-hosted product from NEAR AI today, so we built that piece with a clearly labeled, swappable mock instead of repeating an unverified claim — a distinction most teams claiming “runs in a TEE” won't survive being asked about.</w:t>
       </w:r>
     </w:p>
     <w:p>
       <w:pPr>
         <w:pStyle w:val="ListBullet"/>
+        <w:spacing w:after="80"/>
       </w:pPr>
       <w:r>
         <w:rPr>
@@ -1085,6 +852,7 @@
     <w:p>
       <w:pPr>
         <w:pStyle w:val="ListBullet"/>
+        <w:spacing w:after="80"/>
       </w:pPr>
       <w:r>
         <w:rPr>
@@ -1099,6 +867,7 @@
     <w:p>
       <w:pPr>
         <w:pStyle w:val="ListBullet"/>
+        <w:spacing w:after="80"/>
       </w:pPr>
       <w:r>
         <w:rPr>
@@ -1112,21 +881,16 @@
     </w:p>
     <w:p>
       <w:pPr>
-        <w:keepNext/>
-        <w:spacing w:before="400" w:after="160"/>
+        <w:pStyle w:val="Heading1"/>
       </w:pPr>
       <w:r>
-        <w:rPr>
-          <w:b/>
-          <w:color w:val="0F7666"/>
-          <w:sz w:val="30"/>
-        </w:rPr>
-        <w:t>8. Technical Feasibility &amp; Risk Mitigation</w:t>
+        <w:t>8. Technical Feasibility &amp; Ease of Implementation</w:t>
       </w:r>
     </w:p>
     <w:p>
       <w:pPr>
         <w:pStyle w:val="ListBullet"/>
+        <w:spacing w:after="80"/>
       </w:pPr>
       <w:r>
         <w:rPr>
@@ -1141,6 +905,7 @@
     <w:p>
       <w:pPr>
         <w:pStyle w:val="ListBullet"/>
+        <w:spacing w:after="80"/>
       </w:pPr>
       <w:r>
         <w:rPr>
@@ -1149,12 +914,13 @@
         <w:t xml:space="preserve">Demo reliability — </w:t>
       </w:r>
       <w:r>
-        <w:t>Every service (OPA, Redis, PostgreSQL, Gateway, Console) runs locally via Docker Compose, removing dependence on cloud infrastructure or third-party API uptime during judging. We've verified this boots clean from a fully torn-down state twice in a row.</w:t>
+        <w:t>Every service (OPA, Redis, PostgreSQL, Gateway, Console) runs locally via Docker Compose, removing dependence on cloud infrastructure or third-party API uptime during judging. Verified to boot clean from a fully torn-down state twice in a row.</w:t>
       </w:r>
     </w:p>
     <w:p>
       <w:pPr>
         <w:pStyle w:val="ListBullet"/>
+        <w:spacing w:after="80"/>
       </w:pPr>
       <w:r>
         <w:rPr>
@@ -1169,6 +935,22 @@
     <w:p>
       <w:pPr>
         <w:pStyle w:val="ListBullet"/>
+        <w:spacing w:after="80"/>
+      </w:pPr>
+      <w:r>
+        <w:rPr>
+          <w:b/>
+        </w:rPr>
+        <w:t xml:space="preserve">Ease of implementation — </w:t>
+      </w:r>
+      <w:r>
+        <w:t>Every component is a well-understood, widely deployed technology — OPA, Redis, PostgreSQL, FastAPI — wired together via Docker Compose. There is no novel infrastructure to invent, only correct sequencing and honest scope, which is exactly what a bank's own security review would demand before rollout.</w:t>
+      </w:r>
+    </w:p>
+    <w:p>
+      <w:pPr>
+        <w:pStyle w:val="ListBullet"/>
+        <w:spacing w:after="80"/>
       </w:pPr>
       <w:r>
         <w:rPr>
@@ -1182,46 +964,40 @@
     </w:p>
     <w:p>
       <w:pPr>
-        <w:pStyle w:val="ListBullet"/>
+        <w:pStyle w:val="Heading1"/>
+      </w:pPr>
+      <w:r>
+        <w:t>9. Scalability</w:t>
+      </w:r>
+    </w:p>
+    <w:p>
+      <w:pPr>
+        <w:spacing w:after="120"/>
       </w:pPr>
       <w:r>
         <w:rPr>
           <w:b/>
         </w:rPr>
-        <w:t xml:space="preserve">Scalability — </w:t>
+        <w:t>The gateway is stateless — all fleet, spend, and ledger state lives in Redis and PostgreSQL — so scaling out means running more gateway replicas behind a load balancer, not a redesign. The kill-switch fan-out is already built for this: events relay through Redis Pub/Sub rather than being pushed in-process, so any replica can serve any operator console. Redis and PostgreSQL scale independently via standard clustering and read-replica patterns as fleet size grows, which matters directly for a bank onboarding agent fleets one business line at a time rather than all at once.</w:t>
       </w:r>
       <w:r>
-        <w:t>The gateway is stateless — all fleet, spend, and ledger state lives in Redis and PostgreSQL — so scaling out is running more gateway replicas behind a load balancer, not a redesign. The kill-switch fan-out is already built for this: events relay through Redis Pub/Sub rather than being pushed in-process, so any replica can serve any operator console. Redis and PostgreSQL scale independently via standard clustering and read-replica patterns as fleet size grows.</w:t>
+        <w:rPr>
+          <w:i w:val="0"/>
+        </w:rPr>
       </w:r>
     </w:p>
     <w:p>
       <w:pPr>
-        <w:keepNext/>
-        <w:spacing w:before="400" w:after="160"/>
+        <w:pStyle w:val="Heading1"/>
       </w:pPr>
       <w:r>
-        <w:rPr>
-          <w:b/>
-          <w:color w:val="0F7666"/>
-          <w:sz w:val="30"/>
-        </w:rPr>
-        <w:t>9. Business Impact for American Express</w:t>
-      </w:r>
-    </w:p>
-    <w:p>
-      <w:r>
-        <w:rPr>
-          <w:b w:val="0"/>
-          <w:i w:val="0"/>
-          <w:color w:val="1A1A1A"/>
-          <w:sz w:val="22"/>
-        </w:rPr>
-        <w:t>AegisAgent is not a standalone feature — it is the enabling layer that de-risks every other agentic initiative Amex pursues, from automated servicing to travel rebooking. Concretely, it offers:</w:t>
+        <w:t>10. Business Relevance &amp; Potential Impact</w:t>
       </w:r>
     </w:p>
     <w:p>
       <w:pPr>
         <w:pStyle w:val="ListBullet"/>
+        <w:spacing w:after="80"/>
       </w:pPr>
       <w:r>
         <w:rPr>
@@ -1230,12 +1006,13 @@
         <w:t xml:space="preserve">Systemic risk containment — </w:t>
       </w:r>
       <w:r>
-        <w:t>a single, provable emergency stop across every deployed agent, closing the “who turns it off” gap that makes autonomous deployment a board-level risk conversation today.</w:t>
+        <w:t>A single, provable emergency stop across every deployed agent, closing the “who turns it off” gap that makes autonomous deployment a board-level risk conversation today.</w:t>
       </w:r>
     </w:p>
     <w:p>
       <w:pPr>
         <w:pStyle w:val="ListBullet"/>
+        <w:spacing w:after="80"/>
       </w:pPr>
       <w:r>
         <w:rPr>
@@ -1244,12 +1021,13 @@
         <w:t xml:space="preserve">Audit-ready compliance posture — </w:t>
       </w:r>
       <w:r>
-        <w:t>a cryptographically verifiable log of every autonomous financial decision, structured for regulatory review without custom tooling.</w:t>
+        <w:t>A cryptographically verifiable log of every autonomous financial decision, structured for regulatory review without custom tooling.</w:t>
       </w:r>
     </w:p>
     <w:p>
       <w:pPr>
         <w:pStyle w:val="ListBullet"/>
+        <w:spacing w:after="80"/>
       </w:pPr>
       <w:r>
         <w:rPr>
@@ -1258,12 +1036,13 @@
         <w:t xml:space="preserve">Faster agent rollout — </w:t>
       </w:r>
       <w:r>
-        <w:t>product teams building new agents (servicing, disputes, benefits) inherit permissioning, budgeting, and kill-switch capability for free instead of building it per project.</w:t>
+        <w:t>Product teams building new agents (servicing, disputes, benefits) inherit permissioning, budgeting, and kill-switch capability for free instead of building it per project.</w:t>
       </w:r>
     </w:p>
     <w:p>
       <w:pPr>
         <w:pStyle w:val="ListBullet"/>
+        <w:spacing w:after="80"/>
       </w:pPr>
       <w:r>
         <w:rPr>
@@ -1272,67 +1051,63 @@
         <w:t xml:space="preserve">Quantifiable trust — </w:t>
       </w:r>
       <w:r>
-        <w:t>dynamic, per-agent spend caps turn “trust the model” into a configurable, enforced financial control, the same language Amex risk and compliance teams already use for human employees.</w:t>
+        <w:t>Dynamic, per-agent spend caps turn “trust the model” into a configurable, enforced financial control, the same language Amex risk and compliance teams already use for human employees.</w:t>
       </w:r>
     </w:p>
     <w:p>
       <w:pPr>
-        <w:keepNext/>
-        <w:spacing w:before="400" w:after="160"/>
+        <w:pStyle w:val="Heading1"/>
+      </w:pPr>
+      <w:r>
+        <w:t>11. Round 1 Progress: What's Already Running (Implementation &amp; Impact, Proven)</w:t>
+      </w:r>
+    </w:p>
+    <w:p>
+      <w:pPr>
+        <w:spacing w:after="120"/>
       </w:pPr>
       <w:r>
         <w:rPr>
           <w:b/>
-          <w:color w:val="0F7666"/>
-          <w:sz w:val="30"/>
         </w:rPr>
-        <w:t>10. Round 1 Progress: What's Already Running</w:t>
+        <w:t>Round 1 does not require a working prototype — but ours already exists. Rather than ask judges to take the architecture on faith, we built the enforcement core early and ran the exact five-step demo sequence from our Implementation Guide against it, twice in a row from a clean boot each time. Real screenshots from that run accompany this submission.</w:t>
       </w:r>
-    </w:p>
-    <w:p>
       <w:r>
         <w:rPr>
-          <w:b w:val="0"/>
           <w:i w:val="0"/>
-          <w:color w:val="1A1A1A"/>
-          <w:sz w:val="22"/>
         </w:rPr>
-        <w:t>Round 1 does not require a working prototype — but ours already exists. Rather than ask judges to take the architecture on faith, we built the enforcement core early and ran the exact five-step demo sequence from our Implementation Guide against it, twice in a row from a clean boot each time. Real screenshots from that run accompany this submission (not mockups).</w:t>
       </w:r>
     </w:p>
     <w:p>
       <w:pPr>
-        <w:keepNext/>
-        <w:spacing w:before="240" w:after="80"/>
+        <w:pStyle w:val="Heading2"/>
       </w:pPr>
       <w:r>
-        <w:rPr>
-          <w:b/>
-          <w:color w:val="0B1220"/>
-          <w:sz w:val="25"/>
-        </w:rPr>
         <w:t>Built and demoed today</w:t>
       </w:r>
     </w:p>
     <w:p>
       <w:pPr>
         <w:pStyle w:val="ListBullet"/>
+        <w:spacing w:after="80"/>
       </w:pPr>
       <w:r>
-        <w:t>The Aegis Gateway (FastAPI), enforcing three checks in strict order — revocation, then OPA policy, then an atomic Redis spend cap — exactly as designed, with no shortcuts taken for the demo.</w:t>
+        <w:t>The Aegis Gateway (FastAPI), enforcing three checks in strict order — revocation, then OPA policy, then an atomic Redis spend cap — with no shortcuts taken for the demo.</w:t>
       </w:r>
     </w:p>
     <w:p>
       <w:pPr>
         <w:pStyle w:val="ListBullet"/>
+        <w:spacing w:after="80"/>
       </w:pPr>
       <w:r>
-        <w:t>Deny-by-default OPA policy (Rego), covering three roles (Wealth Advisory, High-Frequency Trader, and a deliberately Rogue/Anomaly agent with zero permitted actions), verified by an automated test suite (opa test, 4/4 passing) — including a test proving an action absent from every role's vocabulary is refused, not just one absent from a role that happens to have an empty list.</w:t>
+        <w:t>Deny-by-default OPA policy (Rego) covering three roles, verified by an automated test suite (opa test, 4/4 passing) — including a test proving an action absent from every role's vocabulary is refused, not just one absent from a role with an empty list.</w:t>
       </w:r>
     </w:p>
     <w:p>
       <w:pPr>
         <w:pStyle w:val="ListBullet"/>
+        <w:spacing w:after="80"/>
       </w:pPr>
       <w:r>
         <w:t>A dynamic spend-cap engine in Redis, hot-reloadable from the operator console: an operator tightened a live agent's budget mid-session during testing and the very next request was evaluated against the new limit, no restart.</w:t>
@@ -1341,6 +1116,7 @@
     <w:p>
       <w:pPr>
         <w:pStyle w:val="ListBullet"/>
+        <w:spacing w:after="80"/>
       </w:pPr>
       <w:r>
         <w:t>A fleet-wide and per-agent kill switch, enforced at the gateway and fanned out over Redis Pub/Sub to every connected console — a halted agent keeps asking and keeps being refused, because enforcement lives at the chokepoint, not in the agent's cooperation.</w:t>
@@ -1349,14 +1125,16 @@
     <w:p>
       <w:pPr>
         <w:pStyle w:val="ListBullet"/>
+        <w:spacing w:after="80"/>
       </w:pPr>
       <w:r>
-        <w:t>A hash-chained PostgreSQL audit ledger recording every allow, deny, and operator action. We tested the tamper-evidence claim directly: mutated a historic row by hand, and both the console's chain check and an independently-written verifier script (which recomputes the hash rule from the schema rather than sharing code with the writer) caught it immediately.</w:t>
+        <w:t>A hash-chained PostgreSQL audit ledger recording every allow, deny, and operator action. We tested the tamper-evidence claim directly: mutated a historic row by hand, and both the console's chain check and an independently-written verifier script caught it immediately.</w:t>
       </w:r>
     </w:p>
     <w:p>
       <w:pPr>
         <w:pStyle w:val="ListBullet"/>
+        <w:spacing w:after="80"/>
       </w:pPr>
       <w:r>
         <w:t>An operator console (Next.js) with live fleet status, a live decision feed, the policy actually in force, spend-cap editing, the kill switch, and the audit ledger's integrity check — all wired to the real gateway, not mocked data.</w:t>
@@ -1365,36 +1143,33 @@
     <w:p>
       <w:pPr>
         <w:pStyle w:val="ListBullet"/>
+        <w:spacing w:after="80"/>
       </w:pPr>
       <w:r>
-        <w:t>Three simulated agents driving continuous, real traffic through the gateway: a compliant Wealth Advisory agent; a High-Frequency Trader that is fully permitted but still gets cut off once its budget is spent, proving policy and budget are genuinely separate controls; and the Rogue agent, scripted to escalate through an out-of-scope transfer, a probing read, and an action outside the entire system's vocabulary — refused every time.</w:t>
+        <w:t>Three simulated agents driving continuous, real traffic: a compliant Wealth Advisory agent; a fully permitted High-Frequency Trader that still gets cut off once its budget is spent, proving policy and budget are genuinely separate controls; and the Rogue agent, scripted to escalate through an out-of-scope transfer, a probing read, and an action outside the system's entire vocabulary — refused every time.</w:t>
       </w:r>
     </w:p>
     <w:p>
       <w:pPr>
         <w:pStyle w:val="ListBullet"/>
+        <w:spacing w:after="80"/>
       </w:pPr>
       <w:r>
-        <w:t>NEAR AI Cloud's TEE attestation, verified independently and directly: we confirmed the attestation endpoint requires no API key or credits, and validated a live, nonce-bound Intel TDX quote and NVIDIA GPU attestation against NEAR's own infrastructure. This capability is real and proven, but is not yet wired into the live agent decision path shown in the demo screenshots — consistent with the honesty note in Section 7.</w:t>
+        <w:t>NEAR AI Cloud's TEE attestation, verified independently: we confirmed the attestation endpoint requires no API key or credits, and validated a live, nonce-bound Intel TDX quote and NVIDIA GPU attestation against NEAR's own infrastructure. This capability is real and proven, but is not yet wired into the live agent decision path shown in the demo screenshots.</w:t>
       </w:r>
     </w:p>
     <w:p>
       <w:pPr>
-        <w:keepNext/>
-        <w:spacing w:before="240" w:after="80"/>
+        <w:pStyle w:val="Heading2"/>
       </w:pPr>
       <w:r>
-        <w:rPr>
-          <w:b/>
-          <w:color w:val="0B1220"/>
-          <w:sz w:val="25"/>
-        </w:rPr>
         <w:t>Explicitly not yet built — planned for Round 2 (Aug 7 – Aug 21)</w:t>
       </w:r>
     </w:p>
     <w:p>
       <w:pPr>
         <w:pStyle w:val="ListBullet"/>
+        <w:spacing w:after="80"/>
       </w:pPr>
       <w:r>
         <w:t>Independent load-test validation of the &lt;10ms p95 / &lt;5ms overhead targets (k6/Locust), plus a chaos test confirming the gateway fails closed if OPA or Redis go down mid-traffic.</w:t>
@@ -1403,14 +1178,16 @@
     <w:p>
       <w:pPr>
         <w:pStyle w:val="ListBullet"/>
+        <w:spacing w:after="80"/>
       </w:pPr>
       <w:r>
-        <w:t>Agent-side caller identity/authentication on /agent-action — today any caller can assert any agent id and role; only the operator endpoints (revoke, restore, cap changes) are key-protected.</w:t>
+        <w:t>Agent-side caller identity/authentication on /agent-action — today any caller can assert any agent id and role; only operator endpoints (revoke, restore, cap changes) are key-protected.</w:t>
       </w:r>
     </w:p>
     <w:p>
       <w:pPr>
         <w:pStyle w:val="ListBullet"/>
+        <w:spacing w:after="80"/>
       </w:pPr>
       <w:r>
         <w:t>Wiring the verified NEAR AI attestation and agent reasoning into the live decision path, so an agent's actual reasoning call — not just a scripted action — drives what reaches the gateway.</w:t>
@@ -1419,50 +1196,897 @@
     <w:p>
       <w:pPr>
         <w:pStyle w:val="ListBullet"/>
+        <w:spacing w:after="80"/>
       </w:pPr>
       <w:r>
         <w:t>A production telemetry pipeline (Prometheus/Grafana). The console's current latency panel reports real, client-measured round-trip times as an honest stand-in, and states plainly that this is not the same measurement as server-side enforcement overhead.</w:t>
       </w:r>
     </w:p>
     <w:p>
+      <w:pPr>
+        <w:spacing w:after="120"/>
+      </w:pPr>
       <w:r>
         <w:rPr>
-          <w:b w:val="0"/>
-          <w:i/>
-          <w:color w:val="1A1A1A"/>
-          <w:sz w:val="22"/>
+          <w:b/>
+          <w:color w:val="555555"/>
         </w:rPr>
         <w:t>Every claim above was independently re-verified rather than assumed while preparing this submission.</w:t>
+      </w:r>
+      <w:r>
+        <w:rPr>
+          <w:i/>
+          <w:color w:val="555555"/>
+        </w:rPr>
       </w:r>
     </w:p>
     <w:p>
       <w:pPr>
-        <w:keepNext/>
-        <w:spacing w:before="400" w:after="160"/>
+        <w:pStyle w:val="Heading1"/>
+      </w:pPr>
+      <w:r>
+        <w:t>12. Why AegisAgent Wins</w:t>
+      </w:r>
+    </w:p>
+    <w:p>
+      <w:pPr>
+        <w:spacing w:after="80"/>
       </w:pPr>
       <w:r>
         <w:rPr>
           <w:b/>
-          <w:color w:val="0F7666"/>
-          <w:sz w:val="30"/>
         </w:rPr>
-        <w:t>11. Team &amp; Delivery Plan</w:t>
+        <w:t>Four things separate this submission from a typical Round 1 entry:</w:t>
+      </w:r>
+      <w:r>
+        <w:rPr>
+          <w:i w:val="0"/>
+        </w:rPr>
       </w:r>
     </w:p>
     <w:p>
+      <w:pPr>
+        <w:pStyle w:val="ListBullet"/>
+        <w:spacing w:after="80"/>
+      </w:pPr>
       <w:r>
         <w:rPr>
-          <w:b w:val="0"/>
+          <w:b/>
+        </w:rPr>
+        <w:t xml:space="preserve">Structural, not observational — </w:t>
+      </w:r>
+      <w:r>
+        <w:t>Most governance entries will describe a permissions dashboard bolted onto agents after the fact. AegisAgent is a mandatory proxy — there is structurally no path around it, which is a materially different security guarantee.</w:t>
+      </w:r>
+    </w:p>
+    <w:p>
+      <w:pPr>
+        <w:pStyle w:val="ListBullet"/>
+        <w:spacing w:after="80"/>
+      </w:pPr>
+      <w:r>
+        <w:rPr>
+          <w:b/>
+        </w:rPr>
+        <w:t xml:space="preserve">Verified, not asserted — </w:t>
+      </w:r>
+      <w:r>
+        <w:t>Most teams will assert “secure” or “verifiable” without a way to prove it. We independently checked our TEE attestation claim against NEAR AI's own infrastructure and disclose exactly what's proven versus mocked — a level of scrutiny most same-week claims don't survive.</w:t>
+      </w:r>
+    </w:p>
+    <w:p>
+      <w:pPr>
+        <w:pStyle w:val="ListBullet"/>
+        <w:spacing w:after="80"/>
+      </w:pPr>
+      <w:r>
+        <w:rPr>
+          <w:b/>
+        </w:rPr>
+        <w:t xml:space="preserve">Demonstrated, not just designed — </w:t>
+      </w:r>
+      <w:r>
+        <w:t>Most Round 1 submissions are slides only. We have a running enforcement core with a live rogue-agent test, tested twice from a clean boot, with real screenshots attached — evidence a judge can question directly instead of taking on faith.</w:t>
+      </w:r>
+    </w:p>
+    <w:p>
+      <w:pPr>
+        <w:pStyle w:val="ListBullet"/>
+        <w:spacing w:after="80"/>
+      </w:pPr>
+      <w:r>
+        <w:rPr>
+          <w:b/>
+        </w:rPr>
+        <w:t xml:space="preserve">Continuous, not one-time — </w:t>
+      </w:r>
+      <w:r>
+        <w:t>Our permission and budget checks re-evaluate on every single action, not once at login, and can revoke an agent mid-flight without needing its cooperation to stop — closing the exact “who turns it off” gap the problem statement names.</w:t>
+      </w:r>
+    </w:p>
+    <w:p>
+      <w:pPr>
+        <w:pStyle w:val="Heading1"/>
+      </w:pPr>
+      <w:r>
+        <w:t>13. Team &amp; Delivery Plan</w:t>
+      </w:r>
+    </w:p>
+    <w:p>
+      <w:pPr>
+        <w:spacing w:after="120"/>
+      </w:pPr>
+      <w:r>
+        <w:rPr>
+          <w:b/>
+        </w:rPr>
+        <w:t>A three-person team split across enforcement, decentralized execution, and operator experience, executing a two-round plan from architecture submission through a working, benchmarked prototype with a live rogue-agent shutdown demo — already partly demonstrated in Round 1, per Section 11.</w:t>
+      </w:r>
+      <w:r>
+        <w:rPr>
           <w:i w:val="0"/>
-          <w:color w:val="1A1A1A"/>
-          <w:sz w:val="22"/>
         </w:rPr>
-        <w:t>A three-person team split across enforcement, decentralized execution, and operator experience, executing a two-round plan from architecture submission through a working, benchmarked prototype with a live rogue-agent shutdown demo — already partly demonstrated in Round 1, per Section 10. Full day-by-day execution detail, code scaffolding, and QA methodology are provided in the accompanying Implementation Guide.</w:t>
+      </w:r>
+    </w:p>
+    <w:tbl>
+      <w:tblPr>
+        <w:tblW w:type="auto" w:w="0"/>
+        <w:tblLayout w:type="fixed"/>
+        <w:tblLook w:firstColumn="1" w:firstRow="1" w:lastColumn="0" w:lastRow="0" w:noHBand="0" w:noVBand="1" w:val="04A0"/>
+      </w:tblPr>
+      <w:tblGrid>
+        <w:gridCol w:w="3216"/>
+        <w:gridCol w:w="3216"/>
+        <w:gridCol w:w="3216"/>
+      </w:tblGrid>
+      <w:tr>
+        <w:tc>
+          <w:tcPr>
+            <w:tcW w:type="dxa" w:w="2448"/>
+            <w:shd w:val="clear" w:color="auto" w:fill="0B1220"/>
+          </w:tcPr>
+          <w:p>
+            <w:r/>
+            <w:r>
+              <w:rPr>
+                <w:b/>
+                <w:color w:val="FFFFFF"/>
+                <w:sz w:val="19"/>
+              </w:rPr>
+              <w:t>Member</w:t>
+            </w:r>
+          </w:p>
+        </w:tc>
+        <w:tc>
+          <w:tcPr>
+            <w:tcW w:type="dxa" w:w="3024"/>
+            <w:shd w:val="clear" w:color="auto" w:fill="0B1220"/>
+          </w:tcPr>
+          <w:p>
+            <w:r/>
+            <w:r>
+              <w:rPr>
+                <w:b/>
+                <w:color w:val="FFFFFF"/>
+                <w:sz w:val="19"/>
+              </w:rPr>
+              <w:t>Role</w:t>
+            </w:r>
+          </w:p>
+        </w:tc>
+        <w:tc>
+          <w:tcPr>
+            <w:tcW w:type="dxa" w:w="4176"/>
+            <w:shd w:val="clear" w:color="auto" w:fill="0B1220"/>
+          </w:tcPr>
+          <w:p>
+            <w:r/>
+            <w:r>
+              <w:rPr>
+                <w:b/>
+                <w:color w:val="FFFFFF"/>
+                <w:sz w:val="19"/>
+              </w:rPr>
+              <w:t>Owns</w:t>
+            </w:r>
+          </w:p>
+        </w:tc>
+      </w:tr>
+      <w:tr>
+        <w:tc>
+          <w:tcPr>
+            <w:tcW w:type="dxa" w:w="2448"/>
+            <w:shd w:val="clear" w:color="auto" w:fill="EDEFF3"/>
+          </w:tcPr>
+          <w:p>
+            <w:r/>
+            <w:r>
+              <w:rPr>
+                <w:b/>
+                <w:sz w:val="19"/>
+              </w:rPr>
+              <w:t>Dev Upadhyay (Team Lead)</w:t>
+            </w:r>
+          </w:p>
+        </w:tc>
+        <w:tc>
+          <w:tcPr>
+            <w:tcW w:type="dxa" w:w="3024"/>
+          </w:tcPr>
+          <w:p>
+            <w:r/>
+            <w:r>
+              <w:rPr>
+                <w:sz w:val="19"/>
+              </w:rPr>
+              <w:t>Backend, Safety Middleware &amp; Policy Lead</w:t>
+            </w:r>
+          </w:p>
+        </w:tc>
+        <w:tc>
+          <w:tcPr>
+            <w:tcW w:type="dxa" w:w="4176"/>
+          </w:tcPr>
+          <w:p>
+            <w:r/>
+            <w:r>
+              <w:rPr>
+                <w:sz w:val="19"/>
+              </w:rPr>
+              <w:t>Aegis Gateway proxy, OPA/Rego policies, Redis spend-cap engine, WebSocket kill-switch API</w:t>
+            </w:r>
+          </w:p>
+        </w:tc>
+      </w:tr>
+      <w:tr>
+        <w:tc>
+          <w:tcPr>
+            <w:tcW w:type="dxa" w:w="2448"/>
+            <w:shd w:val="clear" w:color="auto" w:fill="EDEFF3"/>
+          </w:tcPr>
+          <w:p>
+            <w:r/>
+            <w:r>
+              <w:rPr>
+                <w:b/>
+                <w:sz w:val="19"/>
+              </w:rPr>
+              <w:t>Niti Kanoongo</w:t>
+            </w:r>
+          </w:p>
+        </w:tc>
+        <w:tc>
+          <w:tcPr>
+            <w:tcW w:type="dxa" w:w="3024"/>
+          </w:tcPr>
+          <w:p>
+            <w:r/>
+            <w:r>
+              <w:rPr>
+                <w:sz w:val="19"/>
+              </w:rPr>
+              <w:t>Decentralized AI Integration &amp; Fleet Lead</w:t>
+            </w:r>
+          </w:p>
+        </w:tc>
+        <w:tc>
+          <w:tcPr>
+            <w:tcW w:type="dxa" w:w="4176"/>
+          </w:tcPr>
+          <w:p>
+            <w:r/>
+            <w:r>
+              <w:rPr>
+                <w:sz w:val="19"/>
+              </w:rPr>
+              <w:t>3 agents' reasoning calls wired to NEAR AI Cloud's attested inference API; orchestration layer clearly labeled where mocked</w:t>
+            </w:r>
+          </w:p>
+        </w:tc>
+      </w:tr>
+      <w:tr>
+        <w:tc>
+          <w:tcPr>
+            <w:tcW w:type="dxa" w:w="2448"/>
+            <w:shd w:val="clear" w:color="auto" w:fill="EDEFF3"/>
+          </w:tcPr>
+          <w:p>
+            <w:r/>
+            <w:r>
+              <w:rPr>
+                <w:b/>
+                <w:sz w:val="19"/>
+              </w:rPr>
+              <w:t>Smit Shah</w:t>
+            </w:r>
+          </w:p>
+        </w:tc>
+        <w:tc>
+          <w:tcPr>
+            <w:tcW w:type="dxa" w:w="3024"/>
+          </w:tcPr>
+          <w:p>
+            <w:r/>
+            <w:r>
+              <w:rPr>
+                <w:sz w:val="19"/>
+              </w:rPr>
+              <w:t>Frontend, Telemetry &amp; Audit Lead</w:t>
+            </w:r>
+          </w:p>
+        </w:tc>
+        <w:tc>
+          <w:tcPr>
+            <w:tcW w:type="dxa" w:w="4176"/>
+          </w:tcPr>
+          <w:p>
+            <w:r/>
+            <w:r>
+              <w:rPr>
+                <w:sz w:val="19"/>
+              </w:rPr>
+              <w:t>Operator console, live decision feed, policy editor, kill-switch UI, latency dashboards</w:t>
+            </w:r>
+          </w:p>
+        </w:tc>
+      </w:tr>
+    </w:tbl>
+    <w:p>
+      <w:pPr>
+        <w:spacing w:after="120"/>
+      </w:pPr>
+    </w:p>
+    <w:p>
+      <w:pPr>
+        <w:pStyle w:val="Heading2"/>
+      </w:pPr>
+      <w:r>
+        <w:t>Technology Stack</w:t>
+      </w:r>
+    </w:p>
+    <w:tbl>
+      <w:tblPr>
+        <w:tblW w:type="auto" w:w="0"/>
+        <w:tblLayout w:type="fixed"/>
+        <w:tblLook w:firstColumn="1" w:firstRow="1" w:lastColumn="0" w:lastRow="0" w:noHBand="0" w:noVBand="1" w:val="04A0"/>
+      </w:tblPr>
+      <w:tblGrid>
+        <w:gridCol w:w="2412"/>
+        <w:gridCol w:w="2412"/>
+        <w:gridCol w:w="2412"/>
+        <w:gridCol w:w="2412"/>
+      </w:tblGrid>
+      <w:tr>
+        <w:tc>
+          <w:tcPr>
+            <w:tcW w:type="dxa" w:w="1224"/>
+            <w:shd w:val="clear" w:color="auto" w:fill="0B1220"/>
+          </w:tcPr>
+          <w:p>
+            <w:r/>
+            <w:r>
+              <w:rPr>
+                <w:b/>
+                <w:color w:val="FFFFFF"/>
+                <w:sz w:val="16"/>
+              </w:rPr>
+              <w:t>Layer</w:t>
+            </w:r>
+          </w:p>
+        </w:tc>
+        <w:tc>
+          <w:tcPr>
+            <w:tcW w:type="dxa" w:w="1944"/>
+            <w:shd w:val="clear" w:color="auto" w:fill="0B1220"/>
+          </w:tcPr>
+          <w:p>
+            <w:r/>
+            <w:r>
+              <w:rPr>
+                <w:b/>
+                <w:color w:val="FFFFFF"/>
+                <w:sz w:val="16"/>
+              </w:rPr>
+              <w:t>Component</w:t>
+            </w:r>
+          </w:p>
+        </w:tc>
+        <w:tc>
+          <w:tcPr>
+            <w:tcW w:type="dxa" w:w="2736"/>
+            <w:shd w:val="clear" w:color="auto" w:fill="0B1220"/>
+          </w:tcPr>
+          <w:p>
+            <w:r/>
+            <w:r>
+              <w:rPr>
+                <w:b/>
+                <w:color w:val="FFFFFF"/>
+                <w:sz w:val="16"/>
+              </w:rPr>
+              <w:t>Technology</w:t>
+            </w:r>
+          </w:p>
+        </w:tc>
+        <w:tc>
+          <w:tcPr>
+            <w:tcW w:type="dxa" w:w="3744"/>
+            <w:shd w:val="clear" w:color="auto" w:fill="0B1220"/>
+          </w:tcPr>
+          <w:p>
+            <w:r/>
+            <w:r>
+              <w:rPr>
+                <w:b/>
+                <w:color w:val="FFFFFF"/>
+                <w:sz w:val="16"/>
+              </w:rPr>
+              <w:t>Function</w:t>
+            </w:r>
+          </w:p>
+        </w:tc>
+      </w:tr>
+      <w:tr>
+        <w:tc>
+          <w:tcPr>
+            <w:tcW w:type="dxa" w:w="1224"/>
+            <w:shd w:val="clear" w:color="auto" w:fill="EDEFF3"/>
+          </w:tcPr>
+          <w:p>
+            <w:r/>
+            <w:r>
+              <w:rPr>
+                <w:b/>
+                <w:sz w:val="16"/>
+              </w:rPr>
+              <w:t>Agent Runtime</w:t>
+            </w:r>
+          </w:p>
+        </w:tc>
+        <w:tc>
+          <w:tcPr>
+            <w:tcW w:type="dxa" w:w="1944"/>
+            <w:shd w:val="clear" w:color="auto" w:fill="EDEFF3"/>
+          </w:tcPr>
+          <w:p>
+            <w:r/>
+            <w:r>
+              <w:rPr>
+                <w:b w:val="0"/>
+                <w:sz w:val="16"/>
+              </w:rPr>
+              <w:t>Financial Agent Fleet</w:t>
+            </w:r>
+          </w:p>
+        </w:tc>
+        <w:tc>
+          <w:tcPr>
+            <w:tcW w:type="dxa" w:w="2736"/>
+          </w:tcPr>
+          <w:p>
+            <w:r/>
+            <w:r>
+              <w:rPr>
+                <w:sz w:val="16"/>
+              </w:rPr>
+              <w:t>NEAR AI Cloud (Intel TDX + NVIDIA TEE) for LLM inference; orchestration layer mocked/labeled</w:t>
+            </w:r>
+          </w:p>
+        </w:tc>
+        <w:tc>
+          <w:tcPr>
+            <w:tcW w:type="dxa" w:w="3744"/>
+          </w:tcPr>
+          <w:p>
+            <w:r/>
+            <w:r>
+              <w:rPr>
+                <w:sz w:val="16"/>
+              </w:rPr>
+              <w:t>Agents' reasoning calls route through NEAR AI's attested inference API; orchestration is not a documented TEE product today, so it runs outside a TEE with a clearly labeled mock</w:t>
+            </w:r>
+          </w:p>
+        </w:tc>
+      </w:tr>
+      <w:tr>
+        <w:tc>
+          <w:tcPr>
+            <w:tcW w:type="dxa" w:w="1224"/>
+            <w:shd w:val="clear" w:color="auto" w:fill="EDEFF3"/>
+          </w:tcPr>
+          <w:p>
+            <w:r/>
+            <w:r>
+              <w:rPr>
+                <w:b/>
+                <w:sz w:val="16"/>
+              </w:rPr>
+              <w:t>Enforcement</w:t>
+            </w:r>
+          </w:p>
+        </w:tc>
+        <w:tc>
+          <w:tcPr>
+            <w:tcW w:type="dxa" w:w="1944"/>
+            <w:shd w:val="clear" w:color="auto" w:fill="EDEFF3"/>
+          </w:tcPr>
+          <w:p>
+            <w:r/>
+            <w:r>
+              <w:rPr>
+                <w:b w:val="0"/>
+                <w:sz w:val="16"/>
+              </w:rPr>
+              <w:t>Aegis Gateway Proxy</w:t>
+            </w:r>
+          </w:p>
+        </w:tc>
+        <w:tc>
+          <w:tcPr>
+            <w:tcW w:type="dxa" w:w="2736"/>
+          </w:tcPr>
+          <w:p>
+            <w:r/>
+            <w:r>
+              <w:rPr>
+                <w:sz w:val="16"/>
+              </w:rPr>
+              <w:t>FastAPI (Python) interceptor</w:t>
+            </w:r>
+          </w:p>
+        </w:tc>
+        <w:tc>
+          <w:tcPr>
+            <w:tcW w:type="dxa" w:w="3744"/>
+          </w:tcPr>
+          <w:p>
+            <w:r/>
+            <w:r>
+              <w:rPr>
+                <w:sz w:val="16"/>
+              </w:rPr>
+              <w:t>Sits in front of every banking API call; the only path an agent action can take</w:t>
+            </w:r>
+          </w:p>
+        </w:tc>
+      </w:tr>
+      <w:tr>
+        <w:tc>
+          <w:tcPr>
+            <w:tcW w:type="dxa" w:w="1224"/>
+            <w:shd w:val="clear" w:color="auto" w:fill="EDEFF3"/>
+          </w:tcPr>
+          <w:p>
+            <w:r/>
+            <w:r>
+              <w:rPr>
+                <w:b/>
+                <w:sz w:val="16"/>
+              </w:rPr>
+              <w:t>Policy</w:t>
+            </w:r>
+          </w:p>
+        </w:tc>
+        <w:tc>
+          <w:tcPr>
+            <w:tcW w:type="dxa" w:w="1944"/>
+            <w:shd w:val="clear" w:color="auto" w:fill="EDEFF3"/>
+          </w:tcPr>
+          <w:p>
+            <w:r/>
+            <w:r>
+              <w:rPr>
+                <w:b w:val="0"/>
+                <w:sz w:val="16"/>
+              </w:rPr>
+              <w:t>Zero-Trust Policy Engine</w:t>
+            </w:r>
+          </w:p>
+        </w:tc>
+        <w:tc>
+          <w:tcPr>
+            <w:tcW w:type="dxa" w:w="2736"/>
+          </w:tcPr>
+          <w:p>
+            <w:r/>
+            <w:r>
+              <w:rPr>
+                <w:sz w:val="16"/>
+              </w:rPr>
+              <w:t>Open Policy Agent (Rego), RBAC today</w:t>
+            </w:r>
+          </w:p>
+        </w:tc>
+        <w:tc>
+          <w:tcPr>
+            <w:tcW w:type="dxa" w:w="3744"/>
+          </w:tcPr>
+          <w:p>
+            <w:r/>
+            <w:r>
+              <w:rPr>
+                <w:sz w:val="16"/>
+              </w:rPr>
+              <w:t>Evaluates role and action per request in single-digit milliseconds, deny by default</w:t>
+            </w:r>
+          </w:p>
+        </w:tc>
+      </w:tr>
+      <w:tr>
+        <w:tc>
+          <w:tcPr>
+            <w:tcW w:type="dxa" w:w="1224"/>
+            <w:shd w:val="clear" w:color="auto" w:fill="EDEFF3"/>
+          </w:tcPr>
+          <w:p>
+            <w:r/>
+            <w:r>
+              <w:rPr>
+                <w:b/>
+                <w:sz w:val="16"/>
+              </w:rPr>
+              <w:t>Budget</w:t>
+            </w:r>
+          </w:p>
+        </w:tc>
+        <w:tc>
+          <w:tcPr>
+            <w:tcW w:type="dxa" w:w="1944"/>
+            <w:shd w:val="clear" w:color="auto" w:fill="EDEFF3"/>
+          </w:tcPr>
+          <w:p>
+            <w:r/>
+            <w:r>
+              <w:rPr>
+                <w:b w:val="0"/>
+                <w:sz w:val="16"/>
+              </w:rPr>
+              <w:t>Dynamic Spend Cap Engine</w:t>
+            </w:r>
+          </w:p>
+        </w:tc>
+        <w:tc>
+          <w:tcPr>
+            <w:tcW w:type="dxa" w:w="2736"/>
+          </w:tcPr>
+          <w:p>
+            <w:r/>
+            <w:r>
+              <w:rPr>
+                <w:sz w:val="16"/>
+              </w:rPr>
+              <w:t>Redis (atomic INCRBYFLOAT, Lua scripts)</w:t>
+            </w:r>
+          </w:p>
+        </w:tc>
+        <w:tc>
+          <w:tcPr>
+            <w:tcW w:type="dxa" w:w="3744"/>
+          </w:tcPr>
+          <w:p>
+            <w:r/>
+            <w:r>
+              <w:rPr>
+                <w:sz w:val="16"/>
+              </w:rPr>
+              <w:t>Enforces per-agent and fleet-wide dollar/token limits in real time</w:t>
+            </w:r>
+          </w:p>
+        </w:tc>
+      </w:tr>
+      <w:tr>
+        <w:tc>
+          <w:tcPr>
+            <w:tcW w:type="dxa" w:w="1224"/>
+            <w:shd w:val="clear" w:color="auto" w:fill="EDEFF3"/>
+          </w:tcPr>
+          <w:p>
+            <w:r/>
+            <w:r>
+              <w:rPr>
+                <w:b/>
+                <w:sz w:val="16"/>
+              </w:rPr>
+              <w:t>Control</w:t>
+            </w:r>
+          </w:p>
+        </w:tc>
+        <w:tc>
+          <w:tcPr>
+            <w:tcW w:type="dxa" w:w="1944"/>
+            <w:shd w:val="clear" w:color="auto" w:fill="EDEFF3"/>
+          </w:tcPr>
+          <w:p>
+            <w:r/>
+            <w:r>
+              <w:rPr>
+                <w:b w:val="0"/>
+                <w:sz w:val="16"/>
+              </w:rPr>
+              <w:t>Revocation &amp; Kill-Switch Service</w:t>
+            </w:r>
+          </w:p>
+        </w:tc>
+        <w:tc>
+          <w:tcPr>
+            <w:tcW w:type="dxa" w:w="2736"/>
+          </w:tcPr>
+          <w:p>
+            <w:r/>
+            <w:r>
+              <w:rPr>
+                <w:sz w:val="16"/>
+              </w:rPr>
+              <w:t>WebSocket + Redis Pub/Sub</w:t>
+            </w:r>
+          </w:p>
+        </w:tc>
+        <w:tc>
+          <w:tcPr>
+            <w:tcW w:type="dxa" w:w="3744"/>
+          </w:tcPr>
+          <w:p>
+            <w:r/>
+            <w:r>
+              <w:rPr>
+                <w:sz w:val="16"/>
+              </w:rPr>
+              <w:t>Propagates instant revocation or fleet emergency-stop to every open connection</w:t>
+            </w:r>
+          </w:p>
+        </w:tc>
+      </w:tr>
+      <w:tr>
+        <w:tc>
+          <w:tcPr>
+            <w:tcW w:type="dxa" w:w="1224"/>
+            <w:shd w:val="clear" w:color="auto" w:fill="EDEFF3"/>
+          </w:tcPr>
+          <w:p>
+            <w:r/>
+            <w:r>
+              <w:rPr>
+                <w:b/>
+                <w:sz w:val="16"/>
+              </w:rPr>
+              <w:t>Audit</w:t>
+            </w:r>
+          </w:p>
+        </w:tc>
+        <w:tc>
+          <w:tcPr>
+            <w:tcW w:type="dxa" w:w="1944"/>
+            <w:shd w:val="clear" w:color="auto" w:fill="EDEFF3"/>
+          </w:tcPr>
+          <w:p>
+            <w:r/>
+            <w:r>
+              <w:rPr>
+                <w:b w:val="0"/>
+                <w:sz w:val="16"/>
+              </w:rPr>
+              <w:t>Immutable Ledger</w:t>
+            </w:r>
+          </w:p>
+        </w:tc>
+        <w:tc>
+          <w:tcPr>
+            <w:tcW w:type="dxa" w:w="2736"/>
+          </w:tcPr>
+          <w:p>
+            <w:r/>
+            <w:r>
+              <w:rPr>
+                <w:sz w:val="16"/>
+              </w:rPr>
+              <w:t>PostgreSQL, hash-chained entries</w:t>
+            </w:r>
+          </w:p>
+        </w:tc>
+        <w:tc>
+          <w:tcPr>
+            <w:tcW w:type="dxa" w:w="3744"/>
+          </w:tcPr>
+          <w:p>
+            <w:r/>
+            <w:r>
+              <w:rPr>
+                <w:sz w:val="16"/>
+              </w:rPr>
+              <w:t>Tamper-evident record of every allow/deny decision with full policy reasoning</w:t>
+            </w:r>
+          </w:p>
+        </w:tc>
+      </w:tr>
+      <w:tr>
+        <w:tc>
+          <w:tcPr>
+            <w:tcW w:type="dxa" w:w="1224"/>
+            <w:shd w:val="clear" w:color="auto" w:fill="EDEFF3"/>
+          </w:tcPr>
+          <w:p>
+            <w:r/>
+            <w:r>
+              <w:rPr>
+                <w:b/>
+                <w:sz w:val="16"/>
+              </w:rPr>
+              <w:t>Interface</w:t>
+            </w:r>
+          </w:p>
+        </w:tc>
+        <w:tc>
+          <w:tcPr>
+            <w:tcW w:type="dxa" w:w="1944"/>
+            <w:shd w:val="clear" w:color="auto" w:fill="EDEFF3"/>
+          </w:tcPr>
+          <w:p>
+            <w:r/>
+            <w:r>
+              <w:rPr>
+                <w:b w:val="0"/>
+                <w:sz w:val="16"/>
+              </w:rPr>
+              <w:t>Aegis Operator Console</w:t>
+            </w:r>
+          </w:p>
+        </w:tc>
+        <w:tc>
+          <w:tcPr>
+            <w:tcW w:type="dxa" w:w="2736"/>
+          </w:tcPr>
+          <w:p>
+            <w:r/>
+            <w:r>
+              <w:rPr>
+                <w:sz w:val="16"/>
+              </w:rPr>
+              <w:t>Next.js, Tailwind, WebSockets</w:t>
+            </w:r>
+          </w:p>
+        </w:tc>
+        <w:tc>
+          <w:tcPr>
+            <w:tcW w:type="dxa" w:w="3744"/>
+          </w:tcPr>
+          <w:p>
+            <w:r/>
+            <w:r>
+              <w:rPr>
+                <w:sz w:val="16"/>
+              </w:rPr>
+              <w:t>Live fleet view, policy view, spend-cap editor, audit stream, one-click kill switch</w:t>
+            </w:r>
+          </w:p>
+        </w:tc>
+      </w:tr>
+    </w:tbl>
+    <w:p>
+      <w:pPr>
+        <w:spacing w:after="120"/>
+      </w:pPr>
+    </w:p>
+    <w:p>
+      <w:pPr>
+        <w:spacing w:after="120"/>
+      </w:pPr>
+      <w:r>
+        <w:rPr>
+          <w:b/>
+          <w:color w:val="555555"/>
+        </w:rPr>
+        <w:t>Round 1: Jul 13 kickoff → Jul 27 submission (this document). Round 2: Aug 7 prototype sprint begins → Aug 21 live demo submission.</w:t>
+      </w:r>
+      <w:r>
+        <w:rPr>
+          <w:i/>
+          <w:color w:val="555555"/>
+        </w:rPr>
       </w:r>
     </w:p>
     <w:sectPr>
       <w:pgSz w:w="12240" w:h="15840"/>
-      <w:pgMar w:top="1296" w:right="1440" w:bottom="1296" w:left="1440" w:header="720" w:footer="720" w:gutter="0"/>
+      <w:pgMar w:top="1008" w:right="1296" w:bottom="1008" w:left="1296" w:header="720" w:footer="720" w:gutter="0"/>
       <w:cols w:space="720"/>
       <w:docGrid w:linePitch="360"/>
     </w:sectPr>
@@ -1833,13 +2457,10 @@
     <w:name w:val="Normal"/>
     <w:qFormat/>
     <w:rsid w:val="00FC693F"/>
-    <w:pPr>
-      <w:spacing w:after="160"/>
-    </w:pPr>
     <w:rPr>
       <w:rFonts w:ascii="Calibri" w:hAnsi="Calibri"/>
-      <w:color w:val="1A1A1A"/>
-      <w:sz w:val="22"/>
+      <w:color w:val="222222"/>
+      <w:sz w:val="21"/>
     </w:rPr>
   </w:style>
   <w:style w:type="paragraph" w:styleId="Header">
@@ -1897,15 +2518,15 @@
     <w:pPr>
       <w:keepNext/>
       <w:keepLines/>
-      <w:spacing w:before="480" w:after="0"/>
+      <w:spacing w:before="280" w:after="80"/>
       <w:outlineLvl w:val="0"/>
     </w:pPr>
     <w:rPr>
-      <w:rFonts w:asciiTheme="majorHAnsi" w:eastAsiaTheme="majorEastAsia" w:hAnsiTheme="majorHAnsi" w:cstheme="majorBidi"/>
+      <w:rFonts w:asciiTheme="majorHAnsi" w:eastAsiaTheme="majorEastAsia" w:hAnsiTheme="majorHAnsi" w:cstheme="majorBidi" w:ascii="Calibri" w:hAnsi="Calibri"/>
       <w:b/>
       <w:bCs/>
-      <w:color w:val="365F91" w:themeColor="accent1" w:themeShade="BF"/>
-      <w:sz w:val="28"/>
+      <w:color w:val="0B1220"/>
+      <w:sz w:val="30"/>
       <w:szCs w:val="28"/>
     </w:rPr>
   </w:style>
@@ -1921,15 +2542,15 @@
     <w:pPr>
       <w:keepNext/>
       <w:keepLines/>
-      <w:spacing w:before="200" w:after="0"/>
+      <w:spacing w:before="280" w:after="80"/>
       <w:outlineLvl w:val="1"/>
     </w:pPr>
     <w:rPr>
-      <w:rFonts w:asciiTheme="majorHAnsi" w:eastAsiaTheme="majorEastAsia" w:hAnsiTheme="majorHAnsi" w:cstheme="majorBidi"/>
+      <w:rFonts w:asciiTheme="majorHAnsi" w:eastAsiaTheme="majorEastAsia" w:hAnsiTheme="majorHAnsi" w:cstheme="majorBidi" w:ascii="Calibri" w:hAnsi="Calibri"/>
       <w:b/>
       <w:bCs/>
-      <w:color w:val="4F81BD" w:themeColor="accent1"/>
-      <w:sz w:val="26"/>
+      <w:color w:val="1D4E89"/>
+      <w:sz w:val="25"/>
       <w:szCs w:val="26"/>
     </w:rPr>
   </w:style>

</xml_diff>